<commit_message>
Commit to restart PC
</commit_message>
<xml_diff>
--- a/Task1.docx
+++ b/Task1.docx
@@ -161,16 +161,9 @@
       <w:r>
         <w:t xml:space="preserve"> The current state of the applications functionality is fully functional unless the business is less than 5 years old.</w:t>
       </w:r>
-    </w:p>
-    <w:p>
-      <w:pPr>
-        <w:spacing w:after="0" w:line="240" w:lineRule="auto"/>
-        <w:rPr>
-          <w:rFonts w:ascii="Verdana" w:hAnsi="Verdana" w:cs="Arial"/>
-          <w:sz w:val="20"/>
-          <w:szCs w:val="20"/>
-        </w:rPr>
-      </w:pPr>
+      <w:r>
+        <w:t xml:space="preserve"> For example, if a business older than 5 years applies for a loan, the application will be successful and sent to the appropriate parties for approval. However, if the business is less than 5 years old, the application requests the first 5 years of fiscal financial data. This is incorrect because a business that has existed for less than 5 years does not have 5 fiscal years of financial data.</w:t>
+      </w:r>
     </w:p>
     <w:p>
       <w:pPr>
@@ -531,6 +524,7 @@
           <w:sz w:val="20"/>
           <w:szCs w:val="20"/>
         </w:rPr>
+        <w:lastRenderedPageBreak/>
         <w:t>Implementing new features could be included in fixing the bug or bugs in question but would be out of scope because it would not fix the bug or bugs the ticket refers to. New features can be requested using the appropriate channels.</w:t>
       </w:r>
     </w:p>
@@ -879,6 +873,144 @@
       <w:pPr>
         <w:pStyle w:val="ListParagraph"/>
         <w:numPr>
+          <w:ilvl w:val="1"/>
+          <w:numId w:val="14"/>
+        </w:numPr>
+        <w:spacing w:after="0" w:line="240" w:lineRule="auto"/>
+        <w:rPr>
+          <w:rFonts w:ascii="Verdana" w:hAnsi="Verdana" w:cs="Arial"/>
+          <w:sz w:val="20"/>
+          <w:szCs w:val="20"/>
+        </w:rPr>
+      </w:pPr>
+      <w:r>
+        <w:rPr>
+          <w:rFonts w:ascii="Verdana" w:hAnsi="Verdana" w:cs="Arial"/>
+          <w:sz w:val="20"/>
+          <w:szCs w:val="20"/>
+        </w:rPr>
+        <w:t>Constraints:</w:t>
+      </w:r>
+    </w:p>
+    <w:p>
+      <w:pPr>
+        <w:pStyle w:val="ListParagraph"/>
+        <w:numPr>
+          <w:ilvl w:val="2"/>
+          <w:numId w:val="14"/>
+        </w:numPr>
+        <w:spacing w:after="0" w:line="240" w:lineRule="auto"/>
+        <w:rPr>
+          <w:rFonts w:ascii="Verdana" w:hAnsi="Verdana" w:cs="Arial"/>
+          <w:sz w:val="20"/>
+          <w:szCs w:val="20"/>
+        </w:rPr>
+      </w:pPr>
+      <w:r>
+        <w:rPr>
+          <w:rFonts w:ascii="Verdana" w:hAnsi="Verdana" w:cs="Arial"/>
+          <w:sz w:val="20"/>
+          <w:szCs w:val="20"/>
+        </w:rPr>
+        <w:t>The business establishment data cannot be a future date or the current date</w:t>
+      </w:r>
+    </w:p>
+    <w:p>
+      <w:pPr>
+        <w:pStyle w:val="ListParagraph"/>
+        <w:numPr>
+          <w:ilvl w:val="2"/>
+          <w:numId w:val="14"/>
+        </w:numPr>
+        <w:spacing w:after="0" w:line="240" w:lineRule="auto"/>
+        <w:rPr>
+          <w:rFonts w:ascii="Verdana" w:hAnsi="Verdana" w:cs="Arial"/>
+          <w:sz w:val="20"/>
+          <w:szCs w:val="20"/>
+        </w:rPr>
+      </w:pPr>
+      <w:r>
+        <w:rPr>
+          <w:rFonts w:ascii="Verdana" w:hAnsi="Verdana" w:cs="Arial"/>
+          <w:sz w:val="20"/>
+          <w:szCs w:val="20"/>
+        </w:rPr>
+        <w:t>The earliest accepted establishment data is January 1, 1850</w:t>
+      </w:r>
+    </w:p>
+    <w:p>
+      <w:pPr>
+        <w:pStyle w:val="ListParagraph"/>
+        <w:numPr>
+          <w:ilvl w:val="2"/>
+          <w:numId w:val="14"/>
+        </w:numPr>
+        <w:spacing w:after="0" w:line="240" w:lineRule="auto"/>
+        <w:rPr>
+          <w:rFonts w:ascii="Verdana" w:hAnsi="Verdana" w:cs="Arial"/>
+          <w:sz w:val="20"/>
+          <w:szCs w:val="20"/>
+        </w:rPr>
+      </w:pPr>
+      <w:r>
+        <w:rPr>
+          <w:rFonts w:ascii="Verdana" w:hAnsi="Verdana" w:cs="Arial"/>
+          <w:sz w:val="20"/>
+          <w:szCs w:val="20"/>
+        </w:rPr>
+        <w:t>Business age is calculated based on complete fiscal years</w:t>
+      </w:r>
+    </w:p>
+    <w:p>
+      <w:pPr>
+        <w:pStyle w:val="ListParagraph"/>
+        <w:numPr>
+          <w:ilvl w:val="2"/>
+          <w:numId w:val="14"/>
+        </w:numPr>
+        <w:spacing w:after="0" w:line="240" w:lineRule="auto"/>
+        <w:rPr>
+          <w:rFonts w:ascii="Verdana" w:hAnsi="Verdana" w:cs="Arial"/>
+          <w:sz w:val="20"/>
+          <w:szCs w:val="20"/>
+        </w:rPr>
+      </w:pPr>
+      <w:r>
+        <w:rPr>
+          <w:rFonts w:ascii="Verdana" w:hAnsi="Verdana" w:cs="Arial"/>
+          <w:sz w:val="20"/>
+          <w:szCs w:val="20"/>
+        </w:rPr>
+        <w:t>A maximum of 5 financial data entry fields will be displayed at any time</w:t>
+      </w:r>
+    </w:p>
+    <w:p>
+      <w:pPr>
+        <w:pStyle w:val="ListParagraph"/>
+        <w:numPr>
+          <w:ilvl w:val="2"/>
+          <w:numId w:val="14"/>
+        </w:numPr>
+        <w:spacing w:after="0" w:line="240" w:lineRule="auto"/>
+        <w:rPr>
+          <w:rFonts w:ascii="Verdana" w:hAnsi="Verdana" w:cs="Arial"/>
+          <w:sz w:val="20"/>
+          <w:szCs w:val="20"/>
+        </w:rPr>
+      </w:pPr>
+      <w:r>
+        <w:rPr>
+          <w:rFonts w:ascii="Verdana" w:hAnsi="Verdana" w:cs="Arial"/>
+          <w:sz w:val="20"/>
+          <w:szCs w:val="20"/>
+        </w:rPr>
+        <w:t>Forecasted data fields will be generated for consecutive future years until a total of 5 financial periods are available for input</w:t>
+      </w:r>
+    </w:p>
+    <w:p>
+      <w:pPr>
+        <w:pStyle w:val="ListParagraph"/>
+        <w:numPr>
           <w:ilvl w:val="0"/>
           <w:numId w:val="14"/>
         </w:numPr>
@@ -1033,7 +1165,169 @@
           <w:sz w:val="20"/>
           <w:szCs w:val="20"/>
         </w:rPr>
+        <w:lastRenderedPageBreak/>
         <w:t>If validation fails, an error message will appear and the fields for which the validation failed are highlighted red.</w:t>
+      </w:r>
+    </w:p>
+    <w:p>
+      <w:pPr>
+        <w:pStyle w:val="ListParagraph"/>
+        <w:numPr>
+          <w:ilvl w:val="1"/>
+          <w:numId w:val="14"/>
+        </w:numPr>
+        <w:spacing w:after="0" w:line="240" w:lineRule="auto"/>
+        <w:rPr>
+          <w:rFonts w:ascii="Verdana" w:hAnsi="Verdana" w:cs="Arial"/>
+          <w:sz w:val="20"/>
+          <w:szCs w:val="20"/>
+        </w:rPr>
+      </w:pPr>
+      <w:r>
+        <w:rPr>
+          <w:rFonts w:ascii="Verdana" w:hAnsi="Verdana" w:cs="Arial"/>
+          <w:sz w:val="20"/>
+          <w:szCs w:val="20"/>
+        </w:rPr>
+        <w:t>Constraints:</w:t>
+      </w:r>
+    </w:p>
+    <w:p>
+      <w:pPr>
+        <w:pStyle w:val="ListParagraph"/>
+        <w:numPr>
+          <w:ilvl w:val="2"/>
+          <w:numId w:val="14"/>
+        </w:numPr>
+        <w:spacing w:after="0" w:line="240" w:lineRule="auto"/>
+        <w:rPr>
+          <w:rFonts w:ascii="Verdana" w:hAnsi="Verdana" w:cs="Arial"/>
+          <w:sz w:val="20"/>
+          <w:szCs w:val="20"/>
+        </w:rPr>
+      </w:pPr>
+      <w:r>
+        <w:rPr>
+          <w:rFonts w:ascii="Verdana" w:hAnsi="Verdana" w:cs="Arial"/>
+          <w:sz w:val="20"/>
+          <w:szCs w:val="20"/>
+        </w:rPr>
+        <w:t>All financial data fields displayed are mandatory</w:t>
+      </w:r>
+    </w:p>
+    <w:p>
+      <w:pPr>
+        <w:pStyle w:val="ListParagraph"/>
+        <w:numPr>
+          <w:ilvl w:val="2"/>
+          <w:numId w:val="14"/>
+        </w:numPr>
+        <w:spacing w:after="0" w:line="240" w:lineRule="auto"/>
+        <w:rPr>
+          <w:rFonts w:ascii="Verdana" w:hAnsi="Verdana" w:cs="Arial"/>
+          <w:sz w:val="20"/>
+          <w:szCs w:val="20"/>
+        </w:rPr>
+      </w:pPr>
+      <w:r>
+        <w:rPr>
+          <w:rFonts w:ascii="Verdana" w:hAnsi="Verdana" w:cs="Arial"/>
+          <w:sz w:val="20"/>
+          <w:szCs w:val="20"/>
+        </w:rPr>
+        <w:t>All financial data fields must be numerical</w:t>
+      </w:r>
+    </w:p>
+    <w:p>
+      <w:pPr>
+        <w:pStyle w:val="ListParagraph"/>
+        <w:numPr>
+          <w:ilvl w:val="2"/>
+          <w:numId w:val="14"/>
+        </w:numPr>
+        <w:spacing w:after="0" w:line="240" w:lineRule="auto"/>
+        <w:rPr>
+          <w:rFonts w:ascii="Verdana" w:hAnsi="Verdana" w:cs="Arial"/>
+          <w:sz w:val="20"/>
+          <w:szCs w:val="20"/>
+        </w:rPr>
+      </w:pPr>
+      <w:r>
+        <w:rPr>
+          <w:rFonts w:ascii="Verdana" w:hAnsi="Verdana" w:cs="Arial"/>
+          <w:sz w:val="20"/>
+          <w:szCs w:val="20"/>
+        </w:rPr>
+        <w:t>Numerical input must conform to a standard currency format</w:t>
+      </w:r>
+    </w:p>
+    <w:p>
+      <w:pPr>
+        <w:pStyle w:val="ListParagraph"/>
+        <w:numPr>
+          <w:ilvl w:val="2"/>
+          <w:numId w:val="14"/>
+        </w:numPr>
+        <w:spacing w:after="0" w:line="240" w:lineRule="auto"/>
+        <w:rPr>
+          <w:rFonts w:ascii="Verdana" w:hAnsi="Verdana" w:cs="Arial"/>
+          <w:sz w:val="20"/>
+          <w:szCs w:val="20"/>
+        </w:rPr>
+      </w:pPr>
+      <w:r>
+        <w:rPr>
+          <w:rFonts w:ascii="Verdana" w:hAnsi="Verdana" w:cs="Arial"/>
+          <w:sz w:val="20"/>
+          <w:szCs w:val="20"/>
+        </w:rPr>
+        <w:t>Error messages will be user-friendly and clearly indicate which field failed validation and why.</w:t>
+      </w:r>
+    </w:p>
+    <w:p>
+      <w:pPr>
+        <w:pStyle w:val="ListParagraph"/>
+        <w:numPr>
+          <w:ilvl w:val="2"/>
+          <w:numId w:val="14"/>
+        </w:numPr>
+        <w:spacing w:after="0" w:line="240" w:lineRule="auto"/>
+        <w:rPr>
+          <w:rFonts w:ascii="Verdana" w:hAnsi="Verdana" w:cs="Arial"/>
+          <w:sz w:val="20"/>
+          <w:szCs w:val="20"/>
+        </w:rPr>
+      </w:pPr>
+      <w:r>
+        <w:rPr>
+          <w:rFonts w:ascii="Verdana" w:hAnsi="Verdana" w:cs="Arial"/>
+          <w:sz w:val="20"/>
+          <w:szCs w:val="20"/>
+        </w:rPr>
+        <w:t>General validation errors will appear at the top of the form, while specific field errors will appear directly below the invalid field.</w:t>
+      </w:r>
+    </w:p>
+    <w:p>
+      <w:pPr>
+        <w:pStyle w:val="ListParagraph"/>
+        <w:numPr>
+          <w:ilvl w:val="2"/>
+          <w:numId w:val="14"/>
+        </w:numPr>
+        <w:spacing w:after="0" w:line="240" w:lineRule="auto"/>
+        <w:rPr>
+          <w:rFonts w:ascii="Verdana" w:hAnsi="Verdana" w:cs="Arial"/>
+          <w:sz w:val="20"/>
+          <w:szCs w:val="20"/>
+        </w:rPr>
+      </w:pPr>
+      <w:r>
+        <w:rPr>
+          <w:rFonts w:ascii="Verdana" w:hAnsi="Verdana" w:cs="Arial"/>
+          <w:sz w:val="20"/>
+          <w:szCs w:val="20"/>
+        </w:rPr>
+        <w:t>The user will not be able to proceed to the next section until all validation errors are resolved and the data successfully passes validation.</w:t>
       </w:r>
     </w:p>
     <w:p>
@@ -1180,7 +1474,6 @@
           <w:sz w:val="20"/>
           <w:szCs w:val="20"/>
         </w:rPr>
-        <w:lastRenderedPageBreak/>
         <w:t>Fiscal_year_input_field: A reuseable component responsible for displaying a single fiscal year input field. Each instance will handle its own state for input values and validation</w:t>
       </w:r>
     </w:p>
@@ -1595,6 +1888,7 @@
           <w:sz w:val="20"/>
           <w:szCs w:val="20"/>
         </w:rPr>
+        <w:lastRenderedPageBreak/>
         <w:t>Segmentation:</w:t>
       </w:r>
     </w:p>
@@ -1966,7 +2260,6 @@
           <w:sz w:val="20"/>
           <w:szCs w:val="20"/>
         </w:rPr>
-        <w:lastRenderedPageBreak/>
         <w:t>Receiving financial data submissions from the front end</w:t>
       </w:r>
     </w:p>
@@ -2473,6 +2766,7 @@
           <w:sz w:val="20"/>
           <w:szCs w:val="20"/>
         </w:rPr>
+        <w:lastRenderedPageBreak/>
         <w:t>Retrieving existing financial data for a loan application</w:t>
       </w:r>
     </w:p>
@@ -2773,7 +3067,7 @@
         <w:pStyle w:val="ListParagraph"/>
         <w:numPr>
           <w:ilvl w:val="0"/>
-          <w:numId w:val="6"/>
+          <w:numId w:val="16"/>
         </w:numPr>
         <w:spacing w:after="0" w:line="240" w:lineRule="auto"/>
         <w:rPr>
@@ -2796,15 +3090,23 @@
         <w:pStyle w:val="ListParagraph"/>
         <w:numPr>
           <w:ilvl w:val="1"/>
-          <w:numId w:val="6"/>
-        </w:numPr>
-        <w:spacing w:after="0" w:line="240" w:lineRule="auto"/>
-        <w:rPr>
-          <w:rFonts w:ascii="Verdana" w:hAnsi="Verdana" w:cs="Arial"/>
-          <w:sz w:val="20"/>
-          <w:szCs w:val="20"/>
-        </w:rPr>
-      </w:pPr>
+          <w:numId w:val="16"/>
+        </w:numPr>
+        <w:spacing w:after="0" w:line="240" w:lineRule="auto"/>
+        <w:rPr>
+          <w:rFonts w:ascii="Verdana" w:hAnsi="Verdana" w:cs="Arial"/>
+          <w:sz w:val="20"/>
+          <w:szCs w:val="20"/>
+        </w:rPr>
+      </w:pPr>
+      <w:r>
+        <w:rPr>
+          <w:rFonts w:ascii="Verdana" w:hAnsi="Verdana" w:cs="Arial"/>
+          <w:sz w:val="20"/>
+          <w:szCs w:val="20"/>
+        </w:rPr>
+        <w:t xml:space="preserve">Deliverable 1: </w:t>
+      </w:r>
       <w:r>
         <w:rPr>
           <w:rFonts w:ascii="Verdana" w:hAnsi="Verdana" w:cs="Arial"/>
@@ -2818,8 +3120,192 @@
       <w:pPr>
         <w:pStyle w:val="ListParagraph"/>
         <w:numPr>
+          <w:ilvl w:val="2"/>
+          <w:numId w:val="16"/>
+        </w:numPr>
+        <w:spacing w:after="0" w:line="240" w:lineRule="auto"/>
+        <w:rPr>
+          <w:rFonts w:ascii="Verdana" w:hAnsi="Verdana" w:cs="Arial"/>
+          <w:sz w:val="20"/>
+          <w:szCs w:val="20"/>
+        </w:rPr>
+      </w:pPr>
+      <w:r>
+        <w:rPr>
+          <w:rFonts w:ascii="Verdana" w:hAnsi="Verdana" w:cs="Arial"/>
+          <w:sz w:val="20"/>
+          <w:szCs w:val="20"/>
+        </w:rPr>
+        <w:t>Steps to arrive at this deliverable:</w:t>
+      </w:r>
+    </w:p>
+    <w:p>
+      <w:pPr>
+        <w:pStyle w:val="ListParagraph"/>
+        <w:numPr>
+          <w:ilvl w:val="3"/>
+          <w:numId w:val="16"/>
+        </w:numPr>
+        <w:spacing w:after="0" w:line="240" w:lineRule="auto"/>
+        <w:rPr>
+          <w:rFonts w:ascii="Verdana" w:hAnsi="Verdana" w:cs="Arial"/>
+          <w:sz w:val="20"/>
+          <w:szCs w:val="20"/>
+        </w:rPr>
+      </w:pPr>
+      <w:r>
+        <w:rPr>
+          <w:rFonts w:ascii="Verdana" w:hAnsi="Verdana" w:cs="Arial"/>
+          <w:sz w:val="20"/>
+          <w:szCs w:val="20"/>
+        </w:rPr>
+        <w:t>Capture business establishment date: The system will receive the business establishment date from the user’s input</w:t>
+      </w:r>
+    </w:p>
+    <w:p>
+      <w:pPr>
+        <w:pStyle w:val="ListParagraph"/>
+        <w:numPr>
+          <w:ilvl w:val="3"/>
+          <w:numId w:val="16"/>
+        </w:numPr>
+        <w:spacing w:after="0" w:line="240" w:lineRule="auto"/>
+        <w:rPr>
+          <w:rFonts w:ascii="Verdana" w:hAnsi="Verdana" w:cs="Arial"/>
+          <w:sz w:val="20"/>
+          <w:szCs w:val="20"/>
+        </w:rPr>
+      </w:pPr>
+      <w:r>
+        <w:rPr>
+          <w:rFonts w:ascii="Verdana" w:hAnsi="Verdana" w:cs="Arial"/>
+          <w:sz w:val="20"/>
+          <w:szCs w:val="20"/>
+        </w:rPr>
+        <w:t>Determine current date: the system will retrieve the current system date</w:t>
+      </w:r>
+    </w:p>
+    <w:p>
+      <w:pPr>
+        <w:pStyle w:val="ListParagraph"/>
+        <w:numPr>
+          <w:ilvl w:val="3"/>
+          <w:numId w:val="16"/>
+        </w:numPr>
+        <w:spacing w:after="0" w:line="240" w:lineRule="auto"/>
+        <w:rPr>
+          <w:rFonts w:ascii="Verdana" w:hAnsi="Verdana" w:cs="Arial"/>
+          <w:sz w:val="20"/>
+          <w:szCs w:val="20"/>
+        </w:rPr>
+      </w:pPr>
+      <w:r>
+        <w:rPr>
+          <w:rFonts w:ascii="Verdana" w:hAnsi="Verdana" w:cs="Arial"/>
+          <w:sz w:val="20"/>
+          <w:szCs w:val="20"/>
+        </w:rPr>
+        <w:t>Calculate business age: The system will calculate the total number of completed fiscal years since the business establishment date up to the end of the last complete fiscal year relative to the current date</w:t>
+      </w:r>
+    </w:p>
+    <w:p>
+      <w:pPr>
+        <w:pStyle w:val="ListParagraph"/>
+        <w:numPr>
+          <w:ilvl w:val="3"/>
+          <w:numId w:val="16"/>
+        </w:numPr>
+        <w:spacing w:after="0" w:line="240" w:lineRule="auto"/>
+        <w:rPr>
+          <w:rFonts w:ascii="Verdana" w:hAnsi="Verdana" w:cs="Arial"/>
+          <w:sz w:val="20"/>
+          <w:szCs w:val="20"/>
+        </w:rPr>
+      </w:pPr>
+      <w:r>
+        <w:rPr>
+          <w:rFonts w:ascii="Verdana" w:hAnsi="Verdana" w:cs="Arial"/>
+          <w:sz w:val="20"/>
+          <w:szCs w:val="20"/>
+        </w:rPr>
+        <w:t>Conditional logic for age: The system will evaluate if the calculated business age is greater than or equal to the five full fiscal years</w:t>
+      </w:r>
+    </w:p>
+    <w:p>
+      <w:pPr>
+        <w:pStyle w:val="ListParagraph"/>
+        <w:numPr>
+          <w:ilvl w:val="3"/>
+          <w:numId w:val="16"/>
+        </w:numPr>
+        <w:spacing w:after="0" w:line="240" w:lineRule="auto"/>
+        <w:rPr>
+          <w:rFonts w:ascii="Verdana" w:hAnsi="Verdana" w:cs="Arial"/>
+          <w:sz w:val="20"/>
+          <w:szCs w:val="20"/>
+        </w:rPr>
+      </w:pPr>
+      <w:r>
+        <w:rPr>
+          <w:rFonts w:ascii="Verdana" w:hAnsi="Verdana" w:cs="Arial"/>
+          <w:sz w:val="20"/>
+          <w:szCs w:val="20"/>
+        </w:rPr>
+        <w:t>Identify most recent fiscal years: If the business is five years or older, the system will identify the five most recently completed fiscal years</w:t>
+      </w:r>
+    </w:p>
+    <w:p>
+      <w:pPr>
+        <w:pStyle w:val="ListParagraph"/>
+        <w:numPr>
+          <w:ilvl w:val="3"/>
+          <w:numId w:val="16"/>
+        </w:numPr>
+        <w:spacing w:after="0" w:line="240" w:lineRule="auto"/>
+        <w:rPr>
+          <w:rFonts w:ascii="Verdana" w:hAnsi="Verdana" w:cs="Arial"/>
+          <w:sz w:val="20"/>
+          <w:szCs w:val="20"/>
+        </w:rPr>
+      </w:pPr>
+      <w:r>
+        <w:rPr>
+          <w:rFonts w:ascii="Verdana" w:hAnsi="Verdana" w:cs="Arial"/>
+          <w:sz w:val="20"/>
+          <w:szCs w:val="20"/>
+        </w:rPr>
+        <w:t>Dynamic field generation: For each of the identified five fiscal years, the system will dynamically generate and display the required input fields for financial data</w:t>
+      </w:r>
+    </w:p>
+    <w:p>
+      <w:pPr>
+        <w:pStyle w:val="ListParagraph"/>
+        <w:numPr>
+          <w:ilvl w:val="3"/>
+          <w:numId w:val="16"/>
+        </w:numPr>
+        <w:spacing w:after="0" w:line="240" w:lineRule="auto"/>
+        <w:rPr>
+          <w:rFonts w:ascii="Verdana" w:hAnsi="Verdana" w:cs="Arial"/>
+          <w:sz w:val="20"/>
+          <w:szCs w:val="20"/>
+        </w:rPr>
+      </w:pPr>
+      <w:r>
+        <w:rPr>
+          <w:rFonts w:ascii="Verdana" w:hAnsi="Verdana" w:cs="Arial"/>
+          <w:sz w:val="20"/>
+          <w:szCs w:val="20"/>
+        </w:rPr>
+        <w:t>Lebling historical fields: each generated field will be clearly labeled with its corresponding fiscal year</w:t>
+      </w:r>
+    </w:p>
+    <w:p>
+      <w:pPr>
+        <w:pStyle w:val="ListParagraph"/>
+        <w:numPr>
           <w:ilvl w:val="1"/>
-          <w:numId w:val="6"/>
+          <w:numId w:val="16"/>
         </w:numPr>
         <w:spacing w:after="0" w:line="240" w:lineRule="auto"/>
         <w:rPr>
@@ -2839,6 +3325,283 @@
     </w:p>
     <w:p>
       <w:pPr>
+        <w:pStyle w:val="ListParagraph"/>
+        <w:numPr>
+          <w:ilvl w:val="2"/>
+          <w:numId w:val="16"/>
+        </w:numPr>
+        <w:spacing w:after="0" w:line="240" w:lineRule="auto"/>
+        <w:rPr>
+          <w:rFonts w:ascii="Verdana" w:hAnsi="Verdana" w:cs="Arial"/>
+          <w:sz w:val="20"/>
+          <w:szCs w:val="20"/>
+        </w:rPr>
+      </w:pPr>
+      <w:r>
+        <w:rPr>
+          <w:rFonts w:ascii="Verdana" w:hAnsi="Verdana" w:cs="Arial"/>
+          <w:sz w:val="20"/>
+          <w:szCs w:val="20"/>
+        </w:rPr>
+        <w:t>Steps to arrive at this deliverable</w:t>
+      </w:r>
+    </w:p>
+    <w:p>
+      <w:pPr>
+        <w:pStyle w:val="ListParagraph"/>
+        <w:numPr>
+          <w:ilvl w:val="3"/>
+          <w:numId w:val="16"/>
+        </w:numPr>
+        <w:spacing w:after="0" w:line="240" w:lineRule="auto"/>
+        <w:rPr>
+          <w:rFonts w:ascii="Verdana" w:hAnsi="Verdana" w:cs="Arial"/>
+          <w:sz w:val="20"/>
+          <w:szCs w:val="20"/>
+        </w:rPr>
+      </w:pPr>
+      <w:r>
+        <w:rPr>
+          <w:rFonts w:ascii="Verdana" w:hAnsi="Verdana" w:cs="Arial"/>
+          <w:sz w:val="20"/>
+          <w:szCs w:val="20"/>
+        </w:rPr>
+        <w:t>Capture business establishment date: the system will receive the business establishment date from the user</w:t>
+      </w:r>
+    </w:p>
+    <w:p>
+      <w:pPr>
+        <w:pStyle w:val="ListParagraph"/>
+        <w:numPr>
+          <w:ilvl w:val="3"/>
+          <w:numId w:val="16"/>
+        </w:numPr>
+        <w:spacing w:after="0" w:line="240" w:lineRule="auto"/>
+        <w:rPr>
+          <w:rFonts w:ascii="Verdana" w:hAnsi="Verdana" w:cs="Arial"/>
+          <w:sz w:val="20"/>
+          <w:szCs w:val="20"/>
+        </w:rPr>
+      </w:pPr>
+      <w:r>
+        <w:rPr>
+          <w:rFonts w:ascii="Verdana" w:hAnsi="Verdana" w:cs="Arial"/>
+          <w:sz w:val="20"/>
+          <w:szCs w:val="20"/>
+        </w:rPr>
+        <w:t>Determine the current date: The system will retrieve the current system date</w:t>
+      </w:r>
+    </w:p>
+    <w:p>
+      <w:pPr>
+        <w:pStyle w:val="ListParagraph"/>
+        <w:numPr>
+          <w:ilvl w:val="3"/>
+          <w:numId w:val="16"/>
+        </w:numPr>
+        <w:spacing w:after="0" w:line="240" w:lineRule="auto"/>
+        <w:rPr>
+          <w:rFonts w:ascii="Verdana" w:hAnsi="Verdana" w:cs="Arial"/>
+          <w:sz w:val="20"/>
+          <w:szCs w:val="20"/>
+        </w:rPr>
+      </w:pPr>
+      <w:r>
+        <w:rPr>
+          <w:rFonts w:ascii="Verdana" w:hAnsi="Verdana" w:cs="Arial"/>
+          <w:sz w:val="20"/>
+          <w:szCs w:val="20"/>
+        </w:rPr>
+        <w:t>Calculate business age: The system will calculate the total number of full fiscal years completed since the business establishment date up to the end of the last complete fiscal year relative the current date</w:t>
+      </w:r>
+    </w:p>
+    <w:p>
+      <w:pPr>
+        <w:pStyle w:val="ListParagraph"/>
+        <w:numPr>
+          <w:ilvl w:val="3"/>
+          <w:numId w:val="16"/>
+        </w:numPr>
+        <w:spacing w:after="0" w:line="240" w:lineRule="auto"/>
+        <w:rPr>
+          <w:rFonts w:ascii="Verdana" w:hAnsi="Verdana" w:cs="Arial"/>
+          <w:sz w:val="20"/>
+          <w:szCs w:val="20"/>
+        </w:rPr>
+      </w:pPr>
+      <w:r>
+        <w:rPr>
+          <w:rFonts w:ascii="Verdana" w:hAnsi="Verdana" w:cs="Arial"/>
+          <w:sz w:val="20"/>
+          <w:szCs w:val="20"/>
+        </w:rPr>
+        <w:t>Conditional logic for age: The system will evaluate if the calculated business age is less than five fiscal years</w:t>
+      </w:r>
+    </w:p>
+    <w:p>
+      <w:pPr>
+        <w:pStyle w:val="ListParagraph"/>
+        <w:numPr>
+          <w:ilvl w:val="3"/>
+          <w:numId w:val="16"/>
+        </w:numPr>
+        <w:spacing w:after="0" w:line="240" w:lineRule="auto"/>
+        <w:rPr>
+          <w:rFonts w:ascii="Verdana" w:hAnsi="Verdana" w:cs="Arial"/>
+          <w:sz w:val="20"/>
+          <w:szCs w:val="20"/>
+        </w:rPr>
+      </w:pPr>
+      <w:r>
+        <w:rPr>
+          <w:rFonts w:ascii="Verdana" w:hAnsi="Verdana" w:cs="Arial"/>
+          <w:sz w:val="20"/>
+          <w:szCs w:val="20"/>
+        </w:rPr>
+        <w:t>Identify existing fiscal years: If the business is less than five fiscal years old, the system will identify all complete fiscal years since the business establishment date up to the end of the last complete fiscal year</w:t>
+      </w:r>
+    </w:p>
+    <w:p>
+      <w:pPr>
+        <w:pStyle w:val="ListParagraph"/>
+        <w:numPr>
+          <w:ilvl w:val="3"/>
+          <w:numId w:val="16"/>
+        </w:numPr>
+        <w:spacing w:after="0" w:line="240" w:lineRule="auto"/>
+        <w:rPr>
+          <w:rFonts w:ascii="Verdana" w:hAnsi="Verdana" w:cs="Arial"/>
+          <w:sz w:val="20"/>
+          <w:szCs w:val="20"/>
+        </w:rPr>
+      </w:pPr>
+      <w:r>
+        <w:rPr>
+          <w:rFonts w:ascii="Verdana" w:hAnsi="Verdana" w:cs="Arial"/>
+          <w:sz w:val="20"/>
+          <w:szCs w:val="20"/>
+        </w:rPr>
+        <w:t>Dynamic field generator for existing years: for each of these identified existing fiscal years, the system will dynamically generate and display the required input fields for financial data</w:t>
+      </w:r>
+    </w:p>
+    <w:p>
+      <w:pPr>
+        <w:pStyle w:val="ListParagraph"/>
+        <w:numPr>
+          <w:ilvl w:val="3"/>
+          <w:numId w:val="16"/>
+        </w:numPr>
+        <w:spacing w:after="0" w:line="240" w:lineRule="auto"/>
+        <w:rPr>
+          <w:rFonts w:ascii="Verdana" w:hAnsi="Verdana" w:cs="Arial"/>
+          <w:sz w:val="20"/>
+          <w:szCs w:val="20"/>
+        </w:rPr>
+      </w:pPr>
+      <w:r>
+        <w:rPr>
+          <w:rFonts w:ascii="Verdana" w:hAnsi="Verdana" w:cs="Arial"/>
+          <w:sz w:val="20"/>
+          <w:szCs w:val="20"/>
+        </w:rPr>
+        <w:t>labeling existing fields: each generated field for existing years will be clearly labeled with its corresponding fiscal year</w:t>
+      </w:r>
+    </w:p>
+    <w:p>
+      <w:pPr>
+        <w:pStyle w:val="ListParagraph"/>
+        <w:numPr>
+          <w:ilvl w:val="3"/>
+          <w:numId w:val="16"/>
+        </w:numPr>
+        <w:spacing w:after="0" w:line="240" w:lineRule="auto"/>
+        <w:rPr>
+          <w:rFonts w:ascii="Verdana" w:hAnsi="Verdana" w:cs="Arial"/>
+          <w:sz w:val="20"/>
+          <w:szCs w:val="20"/>
+        </w:rPr>
+      </w:pPr>
+      <w:r>
+        <w:rPr>
+          <w:rFonts w:ascii="Verdana" w:hAnsi="Verdana" w:cs="Arial"/>
+          <w:sz w:val="20"/>
+          <w:szCs w:val="20"/>
+        </w:rPr>
+        <w:t>Calculate remaining years for forecast: The system will determine the number of additional fiscal years required to reach a total of five fiscal years</w:t>
+      </w:r>
+    </w:p>
+    <w:p>
+      <w:pPr>
+        <w:pStyle w:val="ListParagraph"/>
+        <w:numPr>
+          <w:ilvl w:val="3"/>
+          <w:numId w:val="16"/>
+        </w:numPr>
+        <w:spacing w:after="0" w:line="240" w:lineRule="auto"/>
+        <w:rPr>
+          <w:rFonts w:ascii="Verdana" w:hAnsi="Verdana" w:cs="Arial"/>
+          <w:sz w:val="20"/>
+          <w:szCs w:val="20"/>
+        </w:rPr>
+      </w:pPr>
+      <w:r>
+        <w:rPr>
+          <w:rFonts w:ascii="Verdana" w:hAnsi="Verdana" w:cs="Arial"/>
+          <w:sz w:val="20"/>
+          <w:szCs w:val="20"/>
+        </w:rPr>
+        <w:lastRenderedPageBreak/>
+        <w:t>Identify forecasted fiscal years: They system will identify the consecutive future fiscal years, starting from the current fiscal year (if not already included in the existing years) or the next fiscal year until the total of five fiscal periods is met</w:t>
+      </w:r>
+    </w:p>
+    <w:p>
+      <w:pPr>
+        <w:pStyle w:val="ListParagraph"/>
+        <w:numPr>
+          <w:ilvl w:val="3"/>
+          <w:numId w:val="16"/>
+        </w:numPr>
+        <w:spacing w:after="0" w:line="240" w:lineRule="auto"/>
+        <w:rPr>
+          <w:rFonts w:ascii="Verdana" w:hAnsi="Verdana" w:cs="Arial"/>
+          <w:sz w:val="20"/>
+          <w:szCs w:val="20"/>
+        </w:rPr>
+      </w:pPr>
+      <w:r>
+        <w:rPr>
+          <w:rFonts w:ascii="Verdana" w:hAnsi="Verdana" w:cs="Arial"/>
+          <w:sz w:val="20"/>
+          <w:szCs w:val="20"/>
+        </w:rPr>
+        <w:t>Dynamic field generation for forecast: for each of the identified forecasted fiscal years, the system will dynamically generate and display the required input fields for financial data</w:t>
+      </w:r>
+    </w:p>
+    <w:p>
+      <w:pPr>
+        <w:pStyle w:val="ListParagraph"/>
+        <w:numPr>
+          <w:ilvl w:val="3"/>
+          <w:numId w:val="16"/>
+        </w:numPr>
+        <w:spacing w:after="0" w:line="240" w:lineRule="auto"/>
+        <w:rPr>
+          <w:rFonts w:ascii="Verdana" w:hAnsi="Verdana" w:cs="Arial"/>
+          <w:sz w:val="20"/>
+          <w:szCs w:val="20"/>
+        </w:rPr>
+      </w:pPr>
+      <w:r>
+        <w:rPr>
+          <w:rFonts w:ascii="Verdana" w:hAnsi="Verdana" w:cs="Arial"/>
+          <w:sz w:val="20"/>
+          <w:szCs w:val="20"/>
+        </w:rPr>
+        <w:t xml:space="preserve">Labeling forecasted fields: Each generated forecasted field will be clearly labeled to indicate it’s a forecast and its corresponding fiscal year </w:t>
+      </w:r>
+    </w:p>
+    <w:p>
+      <w:pPr>
         <w:spacing w:after="0" w:line="240" w:lineRule="auto"/>
         <w:rPr>
           <w:rFonts w:ascii="Verdana" w:hAnsi="Verdana" w:cs="Arial"/>
@@ -2898,7 +3661,440 @@
           <w:sz w:val="20"/>
           <w:szCs w:val="20"/>
         </w:rPr>
-        <w:t>The updated application will be deployed once the bug is confirmed to be fixed by internal unit testing.</w:t>
+        <w:t>The deployment of the updated load application system, incorporating the identified bug fixes and new functionality for dynamic financial data fields will follow a phased and validated approach to ensure stability, reliability, and data integrity</w:t>
+      </w:r>
+    </w:p>
+    <w:p>
+      <w:pPr>
+        <w:pStyle w:val="ListParagraph"/>
+        <w:numPr>
+          <w:ilvl w:val="0"/>
+          <w:numId w:val="17"/>
+        </w:numPr>
+        <w:spacing w:after="0" w:line="240" w:lineRule="auto"/>
+        <w:rPr>
+          <w:rFonts w:ascii="Verdana" w:hAnsi="Verdana" w:cs="Arial"/>
+          <w:sz w:val="20"/>
+          <w:szCs w:val="20"/>
+        </w:rPr>
+      </w:pPr>
+      <w:r>
+        <w:rPr>
+          <w:rFonts w:ascii="Verdana" w:hAnsi="Verdana" w:cs="Arial"/>
+          <w:sz w:val="20"/>
+          <w:szCs w:val="20"/>
+        </w:rPr>
+        <w:t>Phase 1: Development and internal unit testing</w:t>
+      </w:r>
+    </w:p>
+    <w:p>
+      <w:pPr>
+        <w:pStyle w:val="ListParagraph"/>
+        <w:numPr>
+          <w:ilvl w:val="1"/>
+          <w:numId w:val="17"/>
+        </w:numPr>
+        <w:spacing w:after="0" w:line="240" w:lineRule="auto"/>
+        <w:rPr>
+          <w:rFonts w:ascii="Verdana" w:hAnsi="Verdana" w:cs="Arial"/>
+          <w:sz w:val="20"/>
+          <w:szCs w:val="20"/>
+        </w:rPr>
+      </w:pPr>
+      <w:r>
+        <w:rPr>
+          <w:rFonts w:ascii="Verdana" w:hAnsi="Verdana" w:cs="Arial"/>
+          <w:sz w:val="20"/>
+          <w:szCs w:val="20"/>
+        </w:rPr>
+        <w:t>Description: The development team will implement the required bug fixes and new features. Each implemented component will undergo rigorous internal testing by the test team to verify that individual code modules function correctly in isolation and address the reported issues</w:t>
+      </w:r>
+    </w:p>
+    <w:p>
+      <w:pPr>
+        <w:pStyle w:val="ListParagraph"/>
+        <w:numPr>
+          <w:ilvl w:val="1"/>
+          <w:numId w:val="17"/>
+        </w:numPr>
+        <w:spacing w:after="0" w:line="240" w:lineRule="auto"/>
+        <w:rPr>
+          <w:rFonts w:ascii="Verdana" w:hAnsi="Verdana" w:cs="Arial"/>
+          <w:sz w:val="20"/>
+          <w:szCs w:val="20"/>
+        </w:rPr>
+      </w:pPr>
+      <w:r>
+        <w:rPr>
+          <w:rFonts w:ascii="Verdana" w:hAnsi="Verdana" w:cs="Arial"/>
+          <w:sz w:val="20"/>
+          <w:szCs w:val="20"/>
+        </w:rPr>
+        <w:t xml:space="preserve">Justification: ensure that the core logic and individual components meet their technical specifications and that the reported bugs </w:t>
+      </w:r>
+      <w:r>
+        <w:rPr>
+          <w:rFonts w:ascii="Verdana" w:hAnsi="Verdana" w:cs="Arial"/>
+          <w:sz w:val="20"/>
+          <w:szCs w:val="20"/>
+        </w:rPr>
+        <w:t xml:space="preserve">are resolved at the code level. </w:t>
+      </w:r>
+    </w:p>
+    <w:p>
+      <w:pPr>
+        <w:pStyle w:val="ListParagraph"/>
+        <w:numPr>
+          <w:ilvl w:val="1"/>
+          <w:numId w:val="17"/>
+        </w:numPr>
+        <w:spacing w:after="0" w:line="240" w:lineRule="auto"/>
+        <w:rPr>
+          <w:rFonts w:ascii="Verdana" w:hAnsi="Verdana" w:cs="Arial"/>
+          <w:sz w:val="20"/>
+          <w:szCs w:val="20"/>
+        </w:rPr>
+      </w:pPr>
+      <w:r>
+        <w:rPr>
+          <w:rFonts w:ascii="Verdana" w:hAnsi="Verdana" w:cs="Arial"/>
+          <w:sz w:val="20"/>
+          <w:szCs w:val="20"/>
+        </w:rPr>
+        <w:t>Completion Criteria: All newly developed or modified code passes its associated unit tests and developers confirm the bug fixes locally.</w:t>
+      </w:r>
+    </w:p>
+    <w:p>
+      <w:pPr>
+        <w:pStyle w:val="ListParagraph"/>
+        <w:numPr>
+          <w:ilvl w:val="0"/>
+          <w:numId w:val="17"/>
+        </w:numPr>
+        <w:spacing w:after="0" w:line="240" w:lineRule="auto"/>
+        <w:rPr>
+          <w:rFonts w:ascii="Verdana" w:hAnsi="Verdana" w:cs="Arial"/>
+          <w:sz w:val="20"/>
+          <w:szCs w:val="20"/>
+        </w:rPr>
+      </w:pPr>
+      <w:r>
+        <w:rPr>
+          <w:rFonts w:ascii="Verdana" w:hAnsi="Verdana" w:cs="Arial"/>
+          <w:sz w:val="20"/>
+          <w:szCs w:val="20"/>
+        </w:rPr>
+        <w:t>Phase 2: Integration Testing and Quality Assurance validation</w:t>
+      </w:r>
+    </w:p>
+    <w:p>
+      <w:pPr>
+        <w:pStyle w:val="ListParagraph"/>
+        <w:numPr>
+          <w:ilvl w:val="1"/>
+          <w:numId w:val="17"/>
+        </w:numPr>
+        <w:spacing w:after="0" w:line="240" w:lineRule="auto"/>
+        <w:rPr>
+          <w:rFonts w:ascii="Verdana" w:hAnsi="Verdana" w:cs="Arial"/>
+          <w:sz w:val="20"/>
+          <w:szCs w:val="20"/>
+        </w:rPr>
+      </w:pPr>
+      <w:r>
+        <w:rPr>
+          <w:rFonts w:ascii="Verdana" w:hAnsi="Verdana" w:cs="Arial"/>
+          <w:sz w:val="20"/>
+          <w:szCs w:val="20"/>
+        </w:rPr>
+        <w:t>Description: Once unit testing is complete, the updated components will be integrated into the broader application. The test team will then conduct comprehensive integration testing to ensure that all new and existing features interact correctly within the system. This includes end-to-end testing of the loan application workflow, specifically validating the dynamic display of financial fields, the associated data validation rules, and successful saving of data.</w:t>
+      </w:r>
+    </w:p>
+    <w:p>
+      <w:pPr>
+        <w:pStyle w:val="ListParagraph"/>
+        <w:numPr>
+          <w:ilvl w:val="1"/>
+          <w:numId w:val="17"/>
+        </w:numPr>
+        <w:spacing w:after="0" w:line="240" w:lineRule="auto"/>
+        <w:rPr>
+          <w:rFonts w:ascii="Verdana" w:hAnsi="Verdana" w:cs="Arial"/>
+          <w:sz w:val="20"/>
+          <w:szCs w:val="20"/>
+        </w:rPr>
+      </w:pPr>
+      <w:r>
+        <w:rPr>
+          <w:rFonts w:ascii="Verdana" w:hAnsi="Verdana" w:cs="Arial"/>
+          <w:sz w:val="20"/>
+          <w:szCs w:val="20"/>
+        </w:rPr>
+        <w:t xml:space="preserve">Justification: While unit testing confirms individual components, integration testing is crucial to verify that they work harmoniously together. </w:t>
+      </w:r>
+      <w:r>
+        <w:rPr>
+          <w:rFonts w:ascii="Verdana" w:hAnsi="Verdana" w:cs="Arial"/>
+          <w:sz w:val="20"/>
+          <w:szCs w:val="20"/>
+        </w:rPr>
+        <w:t>Test team</w:t>
+      </w:r>
+      <w:r>
+        <w:rPr>
+          <w:rFonts w:ascii="Verdana" w:hAnsi="Verdana" w:cs="Arial"/>
+          <w:sz w:val="20"/>
+          <w:szCs w:val="20"/>
+        </w:rPr>
+        <w:t xml:space="preserve"> validation provides an independent</w:t>
+      </w:r>
+      <w:r>
+        <w:rPr>
+          <w:rFonts w:ascii="Verdana" w:hAnsi="Verdana" w:cs="Arial"/>
+          <w:sz w:val="20"/>
+          <w:szCs w:val="20"/>
+        </w:rPr>
+        <w:t xml:space="preserve"> and </w:t>
+      </w:r>
+      <w:r>
+        <w:rPr>
+          <w:rFonts w:ascii="Verdana" w:hAnsi="Verdana" w:cs="Arial"/>
+          <w:sz w:val="20"/>
+          <w:szCs w:val="20"/>
+        </w:rPr>
+        <w:t>thorough</w:t>
+      </w:r>
+      <w:r>
+        <w:rPr>
+          <w:rFonts w:ascii="Verdana" w:hAnsi="Verdana" w:cs="Arial"/>
+          <w:sz w:val="20"/>
+          <w:szCs w:val="20"/>
+        </w:rPr>
+        <w:t xml:space="preserve"> assessment from a user perspective, ensuring that the application behaves as expected, is free from regressions and meets all functional requirements before being exposed to a broader audience.</w:t>
+      </w:r>
+    </w:p>
+    <w:p>
+      <w:pPr>
+        <w:pStyle w:val="ListParagraph"/>
+        <w:numPr>
+          <w:ilvl w:val="1"/>
+          <w:numId w:val="17"/>
+        </w:numPr>
+        <w:spacing w:after="0" w:line="240" w:lineRule="auto"/>
+        <w:rPr>
+          <w:rFonts w:ascii="Verdana" w:hAnsi="Verdana" w:cs="Arial"/>
+          <w:sz w:val="20"/>
+          <w:szCs w:val="20"/>
+        </w:rPr>
+      </w:pPr>
+      <w:r>
+        <w:rPr>
+          <w:rFonts w:ascii="Verdana" w:hAnsi="Verdana" w:cs="Arial"/>
+          <w:sz w:val="20"/>
+          <w:szCs w:val="20"/>
+        </w:rPr>
+        <w:t>Completion criteria: all defined test cases for the updated features and existing critical paths pass successfully and no critical or high-priority defects are identified by the test team</w:t>
+      </w:r>
+    </w:p>
+    <w:p>
+      <w:pPr>
+        <w:pStyle w:val="ListParagraph"/>
+        <w:numPr>
+          <w:ilvl w:val="0"/>
+          <w:numId w:val="17"/>
+        </w:numPr>
+        <w:spacing w:after="0" w:line="240" w:lineRule="auto"/>
+        <w:rPr>
+          <w:rFonts w:ascii="Verdana" w:hAnsi="Verdana" w:cs="Arial"/>
+          <w:sz w:val="20"/>
+          <w:szCs w:val="20"/>
+        </w:rPr>
+      </w:pPr>
+      <w:r>
+        <w:rPr>
+          <w:rFonts w:ascii="Verdana" w:hAnsi="Verdana" w:cs="Arial"/>
+          <w:sz w:val="20"/>
+          <w:szCs w:val="20"/>
+        </w:rPr>
+        <w:t>Phase 3: User acceptance testing</w:t>
+      </w:r>
+    </w:p>
+    <w:p>
+      <w:pPr>
+        <w:pStyle w:val="ListParagraph"/>
+        <w:numPr>
+          <w:ilvl w:val="1"/>
+          <w:numId w:val="17"/>
+        </w:numPr>
+        <w:spacing w:after="0" w:line="240" w:lineRule="auto"/>
+        <w:rPr>
+          <w:rFonts w:ascii="Verdana" w:hAnsi="Verdana" w:cs="Arial"/>
+          <w:sz w:val="20"/>
+          <w:szCs w:val="20"/>
+        </w:rPr>
+      </w:pPr>
+      <w:r>
+        <w:rPr>
+          <w:rFonts w:ascii="Verdana" w:hAnsi="Verdana" w:cs="Arial"/>
+          <w:sz w:val="20"/>
+          <w:szCs w:val="20"/>
+        </w:rPr>
+        <w:t>Description: Following successful QA validation, a selected group of end-users or business stakeholders will perform User Acceptance Testing (UAT).</w:t>
+      </w:r>
+      <w:r>
+        <w:rPr>
+          <w:rFonts w:ascii="Verdana" w:hAnsi="Verdana" w:cs="Arial"/>
+          <w:sz w:val="20"/>
+          <w:szCs w:val="20"/>
+        </w:rPr>
+        <w:t xml:space="preserve"> </w:t>
+      </w:r>
+      <w:r>
+        <w:rPr>
+          <w:rFonts w:ascii="Verdana" w:hAnsi="Verdana" w:cs="Arial"/>
+          <w:sz w:val="20"/>
+          <w:szCs w:val="20"/>
+        </w:rPr>
+        <w:t>Feedback from UAT will be reviewed and addressed.</w:t>
+      </w:r>
+    </w:p>
+    <w:p>
+      <w:pPr>
+        <w:pStyle w:val="ListParagraph"/>
+        <w:numPr>
+          <w:ilvl w:val="1"/>
+          <w:numId w:val="17"/>
+        </w:numPr>
+        <w:spacing w:after="0" w:line="240" w:lineRule="auto"/>
+        <w:rPr>
+          <w:rFonts w:ascii="Verdana" w:hAnsi="Verdana" w:cs="Arial"/>
+          <w:sz w:val="20"/>
+          <w:szCs w:val="20"/>
+        </w:rPr>
+      </w:pPr>
+      <w:r>
+        <w:rPr>
+          <w:rFonts w:ascii="Verdana" w:hAnsi="Verdana" w:cs="Arial"/>
+          <w:sz w:val="20"/>
+          <w:szCs w:val="20"/>
+        </w:rPr>
+        <w:t>Justification: UAT provides the final sign-off from the business perspective, reducing the risk of deploying a solution that doesn't meet operational requirements or user workflows.</w:t>
+      </w:r>
+    </w:p>
+    <w:p>
+      <w:pPr>
+        <w:pStyle w:val="ListParagraph"/>
+        <w:numPr>
+          <w:ilvl w:val="1"/>
+          <w:numId w:val="17"/>
+        </w:numPr>
+        <w:spacing w:after="0" w:line="240" w:lineRule="auto"/>
+        <w:rPr>
+          <w:rFonts w:ascii="Verdana" w:hAnsi="Verdana" w:cs="Arial"/>
+          <w:sz w:val="20"/>
+          <w:szCs w:val="20"/>
+        </w:rPr>
+      </w:pPr>
+      <w:r>
+        <w:rPr>
+          <w:rFonts w:ascii="Verdana" w:hAnsi="Verdana" w:cs="Arial"/>
+          <w:sz w:val="20"/>
+          <w:szCs w:val="20"/>
+        </w:rPr>
+        <w:lastRenderedPageBreak/>
+        <w:t>Completion Criteria: Business stakeholders formally approve the updated application, confirming it meets their requirements and is ready for production deployment.</w:t>
+      </w:r>
+    </w:p>
+    <w:p>
+      <w:pPr>
+        <w:pStyle w:val="ListParagraph"/>
+        <w:numPr>
+          <w:ilvl w:val="0"/>
+          <w:numId w:val="17"/>
+        </w:numPr>
+        <w:spacing w:after="0" w:line="240" w:lineRule="auto"/>
+        <w:rPr>
+          <w:rFonts w:ascii="Verdana" w:hAnsi="Verdana" w:cs="Arial"/>
+          <w:sz w:val="20"/>
+          <w:szCs w:val="20"/>
+        </w:rPr>
+      </w:pPr>
+      <w:r>
+        <w:rPr>
+          <w:rFonts w:ascii="Verdana" w:hAnsi="Verdana" w:cs="Arial"/>
+          <w:sz w:val="20"/>
+          <w:szCs w:val="20"/>
+        </w:rPr>
+        <w:t>Phase 4: Product deployment</w:t>
+      </w:r>
+    </w:p>
+    <w:p>
+      <w:pPr>
+        <w:pStyle w:val="ListParagraph"/>
+        <w:numPr>
+          <w:ilvl w:val="1"/>
+          <w:numId w:val="17"/>
+        </w:numPr>
+        <w:spacing w:after="0" w:line="240" w:lineRule="auto"/>
+        <w:rPr>
+          <w:rFonts w:ascii="Verdana" w:hAnsi="Verdana" w:cs="Arial"/>
+          <w:sz w:val="20"/>
+          <w:szCs w:val="20"/>
+        </w:rPr>
+      </w:pPr>
+      <w:r>
+        <w:rPr>
+          <w:rFonts w:ascii="Verdana" w:hAnsi="Verdana" w:cs="Arial"/>
+          <w:sz w:val="20"/>
+          <w:szCs w:val="20"/>
+        </w:rPr>
+        <w:t>Description: Upon successful completion of UAT and formal business approval, the updated application will be deployed to the production environment.</w:t>
+      </w:r>
+    </w:p>
+    <w:p>
+      <w:pPr>
+        <w:pStyle w:val="ListParagraph"/>
+        <w:numPr>
+          <w:ilvl w:val="1"/>
+          <w:numId w:val="17"/>
+        </w:numPr>
+        <w:spacing w:after="0" w:line="240" w:lineRule="auto"/>
+        <w:rPr>
+          <w:rFonts w:ascii="Verdana" w:hAnsi="Verdana" w:cs="Arial"/>
+          <w:sz w:val="20"/>
+          <w:szCs w:val="20"/>
+        </w:rPr>
+      </w:pPr>
+      <w:r>
+        <w:rPr>
+          <w:rFonts w:ascii="Verdana" w:hAnsi="Verdana" w:cs="Arial"/>
+          <w:sz w:val="20"/>
+          <w:szCs w:val="20"/>
+        </w:rPr>
+        <w:t>Justification: This is the final step where the new functionality becomes available to all users. The preceding phases ensure that this deployment is executed with high confidence, minimizing disruption and ensuring a stable, high-quality application for the end-users.</w:t>
+      </w:r>
+    </w:p>
+    <w:p>
+      <w:pPr>
+        <w:pStyle w:val="ListParagraph"/>
+        <w:numPr>
+          <w:ilvl w:val="1"/>
+          <w:numId w:val="17"/>
+        </w:numPr>
+        <w:spacing w:after="0" w:line="240" w:lineRule="auto"/>
+        <w:rPr>
+          <w:rFonts w:ascii="Verdana" w:hAnsi="Verdana" w:cs="Arial"/>
+          <w:sz w:val="20"/>
+          <w:szCs w:val="20"/>
+        </w:rPr>
+      </w:pPr>
+      <w:r>
+        <w:rPr>
+          <w:rFonts w:ascii="Verdana" w:hAnsi="Verdana" w:cs="Arial"/>
+          <w:sz w:val="20"/>
+          <w:szCs w:val="20"/>
+        </w:rPr>
+        <w:t>Completion Criteria: The updated application is live and accessible in the production environment, and initial post-deployment health checks confirm system stability.</w:t>
       </w:r>
     </w:p>
     <w:p>
@@ -2970,6 +4166,537 @@
           <w:szCs w:val="20"/>
         </w:rPr>
       </w:pPr>
+    </w:p>
+    <w:p>
+      <w:pPr>
+        <w:pStyle w:val="ListParagraph"/>
+        <w:numPr>
+          <w:ilvl w:val="0"/>
+          <w:numId w:val="18"/>
+        </w:numPr>
+        <w:spacing w:after="0" w:line="240" w:lineRule="auto"/>
+        <w:rPr>
+          <w:rFonts w:ascii="Verdana" w:hAnsi="Verdana" w:cs="Arial"/>
+          <w:sz w:val="20"/>
+          <w:szCs w:val="20"/>
+        </w:rPr>
+      </w:pPr>
+      <w:r>
+        <w:rPr>
+          <w:rFonts w:ascii="Verdana" w:hAnsi="Verdana" w:cs="Arial"/>
+          <w:sz w:val="20"/>
+          <w:szCs w:val="20"/>
+        </w:rPr>
+        <w:t>Developer workstation (Windows 11)</w:t>
+      </w:r>
+    </w:p>
+    <w:p>
+      <w:pPr>
+        <w:pStyle w:val="ListParagraph"/>
+        <w:numPr>
+          <w:ilvl w:val="1"/>
+          <w:numId w:val="18"/>
+        </w:numPr>
+        <w:spacing w:after="0" w:line="240" w:lineRule="auto"/>
+        <w:rPr>
+          <w:rFonts w:ascii="Verdana" w:hAnsi="Verdana" w:cs="Arial"/>
+          <w:sz w:val="20"/>
+          <w:szCs w:val="20"/>
+        </w:rPr>
+      </w:pPr>
+      <w:r>
+        <w:rPr>
+          <w:rFonts w:ascii="Verdana" w:hAnsi="Verdana" w:cs="Arial"/>
+          <w:sz w:val="20"/>
+          <w:szCs w:val="20"/>
+        </w:rPr>
+        <w:t>Purpose: Each developer will utilize a dedicated workstation running Windows 11 Professional. This operating system provides a stable and widely supported platform that is compatible with all necessary development tools, frameworks, and libraries required for the project. Windows 11 offers native support for various development technologies, ensuring a consistent and productive environment for all team members.</w:t>
+      </w:r>
+    </w:p>
+    <w:p>
+      <w:pPr>
+        <w:pStyle w:val="ListParagraph"/>
+        <w:numPr>
+          <w:ilvl w:val="1"/>
+          <w:numId w:val="18"/>
+        </w:numPr>
+        <w:spacing w:after="0" w:line="240" w:lineRule="auto"/>
+        <w:rPr>
+          <w:rFonts w:ascii="Verdana" w:hAnsi="Verdana" w:cs="Arial"/>
+          <w:sz w:val="20"/>
+          <w:szCs w:val="20"/>
+        </w:rPr>
+      </w:pPr>
+      <w:r>
+        <w:rPr>
+          <w:rFonts w:ascii="Verdana" w:hAnsi="Verdana" w:cs="Arial"/>
+          <w:sz w:val="20"/>
+          <w:szCs w:val="20"/>
+        </w:rPr>
+        <w:t>Key Capabilities:</w:t>
+      </w:r>
+    </w:p>
+    <w:p>
+      <w:pPr>
+        <w:pStyle w:val="ListParagraph"/>
+        <w:numPr>
+          <w:ilvl w:val="2"/>
+          <w:numId w:val="18"/>
+        </w:numPr>
+        <w:spacing w:after="0" w:line="240" w:lineRule="auto"/>
+        <w:rPr>
+          <w:rFonts w:ascii="Verdana" w:hAnsi="Verdana" w:cs="Arial"/>
+          <w:sz w:val="20"/>
+          <w:szCs w:val="20"/>
+        </w:rPr>
+      </w:pPr>
+      <w:r>
+        <w:rPr>
+          <w:rFonts w:ascii="Verdana" w:hAnsi="Verdana" w:cs="Arial"/>
+          <w:sz w:val="20"/>
+          <w:szCs w:val="20"/>
+        </w:rPr>
+        <w:t>Compatibility: Ensures seamless integration with .NET frameworks (if applicable), Java SDKs, and other project-specific dependencies.</w:t>
+      </w:r>
+    </w:p>
+    <w:p>
+      <w:pPr>
+        <w:pStyle w:val="ListParagraph"/>
+        <w:numPr>
+          <w:ilvl w:val="2"/>
+          <w:numId w:val="18"/>
+        </w:numPr>
+        <w:spacing w:after="0" w:line="240" w:lineRule="auto"/>
+        <w:rPr>
+          <w:rFonts w:ascii="Verdana" w:hAnsi="Verdana" w:cs="Arial"/>
+          <w:sz w:val="20"/>
+          <w:szCs w:val="20"/>
+        </w:rPr>
+      </w:pPr>
+      <w:r>
+        <w:rPr>
+          <w:rFonts w:ascii="Verdana" w:hAnsi="Verdana" w:cs="Arial"/>
+          <w:sz w:val="20"/>
+          <w:szCs w:val="20"/>
+        </w:rPr>
+        <w:t>Performance: Provides the necessary processing power and memory to run IDEs, local databases, and application servers efficiently</w:t>
+      </w:r>
+      <w:r>
+        <w:rPr>
+          <w:rFonts w:ascii="Verdana" w:hAnsi="Verdana" w:cs="Arial"/>
+          <w:sz w:val="20"/>
+          <w:szCs w:val="20"/>
+        </w:rPr>
+        <w:t>.</w:t>
+      </w:r>
+    </w:p>
+    <w:p>
+      <w:pPr>
+        <w:pStyle w:val="ListParagraph"/>
+        <w:numPr>
+          <w:ilvl w:val="2"/>
+          <w:numId w:val="18"/>
+        </w:numPr>
+        <w:spacing w:after="0" w:line="240" w:lineRule="auto"/>
+        <w:rPr>
+          <w:rFonts w:ascii="Verdana" w:hAnsi="Verdana" w:cs="Arial"/>
+          <w:sz w:val="20"/>
+          <w:szCs w:val="20"/>
+        </w:rPr>
+      </w:pPr>
+      <w:r>
+        <w:rPr>
+          <w:rFonts w:ascii="Verdana" w:hAnsi="Verdana" w:cs="Arial"/>
+          <w:sz w:val="20"/>
+          <w:szCs w:val="20"/>
+        </w:rPr>
+        <w:t>Security: Leverages Windows Defender and other built-in security features to protect intellectual property and project data.</w:t>
+      </w:r>
+    </w:p>
+    <w:p>
+      <w:pPr>
+        <w:pStyle w:val="ListParagraph"/>
+        <w:numPr>
+          <w:ilvl w:val="0"/>
+          <w:numId w:val="18"/>
+        </w:numPr>
+        <w:spacing w:after="0" w:line="240" w:lineRule="auto"/>
+        <w:rPr>
+          <w:rFonts w:ascii="Verdana" w:hAnsi="Verdana" w:cs="Arial"/>
+          <w:sz w:val="20"/>
+          <w:szCs w:val="20"/>
+        </w:rPr>
+      </w:pPr>
+      <w:r>
+        <w:rPr>
+          <w:rFonts w:ascii="Verdana" w:hAnsi="Verdana" w:cs="Arial"/>
+          <w:sz w:val="20"/>
+          <w:szCs w:val="20"/>
+        </w:rPr>
+        <w:t>Integrated Development Environments (IDEs)</w:t>
+      </w:r>
+    </w:p>
+    <w:p>
+      <w:pPr>
+        <w:pStyle w:val="ListParagraph"/>
+        <w:numPr>
+          <w:ilvl w:val="1"/>
+          <w:numId w:val="18"/>
+        </w:numPr>
+        <w:spacing w:after="0" w:line="240" w:lineRule="auto"/>
+        <w:rPr>
+          <w:rFonts w:ascii="Verdana" w:hAnsi="Verdana" w:cs="Arial"/>
+          <w:sz w:val="20"/>
+          <w:szCs w:val="20"/>
+        </w:rPr>
+      </w:pPr>
+      <w:r>
+        <w:rPr>
+          <w:rFonts w:ascii="Verdana" w:hAnsi="Verdana" w:cs="Arial"/>
+          <w:sz w:val="20"/>
+          <w:szCs w:val="20"/>
+        </w:rPr>
+        <w:t>Purpose: Developers will leverage their preferred industry-leading IDEs, Visual Studio Enterprise or IntelliJ IDEA Ultimate, to maximize productivity and code quality. These IDEs serve as comprehensive software suites that consolidate common developer activities into a single graphical user interface</w:t>
+      </w:r>
+    </w:p>
+    <w:p>
+      <w:pPr>
+        <w:pStyle w:val="ListParagraph"/>
+        <w:numPr>
+          <w:ilvl w:val="1"/>
+          <w:numId w:val="18"/>
+        </w:numPr>
+        <w:spacing w:after="0" w:line="240" w:lineRule="auto"/>
+        <w:rPr>
+          <w:rFonts w:ascii="Verdana" w:hAnsi="Verdana" w:cs="Arial"/>
+          <w:sz w:val="20"/>
+          <w:szCs w:val="20"/>
+        </w:rPr>
+      </w:pPr>
+      <w:r>
+        <w:rPr>
+          <w:rFonts w:ascii="Verdana" w:hAnsi="Verdana" w:cs="Arial"/>
+          <w:sz w:val="20"/>
+          <w:szCs w:val="20"/>
+        </w:rPr>
+        <w:t>Visual Studio Enterprise (For .NET/C# Development)</w:t>
+      </w:r>
+    </w:p>
+    <w:p>
+      <w:pPr>
+        <w:pStyle w:val="ListParagraph"/>
+        <w:numPr>
+          <w:ilvl w:val="2"/>
+          <w:numId w:val="18"/>
+        </w:numPr>
+        <w:spacing w:after="0" w:line="240" w:lineRule="auto"/>
+        <w:rPr>
+          <w:rFonts w:ascii="Verdana" w:hAnsi="Verdana" w:cs="Arial"/>
+          <w:sz w:val="20"/>
+          <w:szCs w:val="20"/>
+        </w:rPr>
+      </w:pPr>
+      <w:r>
+        <w:rPr>
+          <w:rFonts w:ascii="Verdana" w:hAnsi="Verdana" w:cs="Arial"/>
+          <w:sz w:val="20"/>
+          <w:szCs w:val="20"/>
+        </w:rPr>
+        <w:t>Description: This IDE is specifically chosen for projects primarily developed using Microsoft technologies</w:t>
+      </w:r>
+    </w:p>
+    <w:p>
+      <w:pPr>
+        <w:pStyle w:val="ListParagraph"/>
+        <w:numPr>
+          <w:ilvl w:val="2"/>
+          <w:numId w:val="18"/>
+        </w:numPr>
+        <w:spacing w:after="0" w:line="240" w:lineRule="auto"/>
+        <w:rPr>
+          <w:rFonts w:ascii="Verdana" w:hAnsi="Verdana" w:cs="Arial"/>
+          <w:sz w:val="20"/>
+          <w:szCs w:val="20"/>
+        </w:rPr>
+      </w:pPr>
+      <w:r>
+        <w:rPr>
+          <w:rFonts w:ascii="Verdana" w:hAnsi="Verdana" w:cs="Arial"/>
+          <w:sz w:val="20"/>
+          <w:szCs w:val="20"/>
+        </w:rPr>
+        <w:t>Key Capabilities:</w:t>
+      </w:r>
+    </w:p>
+    <w:p>
+      <w:pPr>
+        <w:pStyle w:val="ListParagraph"/>
+        <w:numPr>
+          <w:ilvl w:val="3"/>
+          <w:numId w:val="18"/>
+        </w:numPr>
+        <w:spacing w:after="0" w:line="240" w:lineRule="auto"/>
+        <w:rPr>
+          <w:rFonts w:ascii="Verdana" w:hAnsi="Verdana" w:cs="Arial"/>
+          <w:sz w:val="20"/>
+          <w:szCs w:val="20"/>
+        </w:rPr>
+      </w:pPr>
+      <w:r>
+        <w:rPr>
+          <w:rFonts w:ascii="Verdana" w:hAnsi="Verdana" w:cs="Arial"/>
+          <w:sz w:val="20"/>
+          <w:szCs w:val="20"/>
+        </w:rPr>
+        <w:t>Advanced Debugging: Offers powerful debugging tools, including breakpoints, step-through execution, and variable inspection, crucial for identifying and resolving complex issues.</w:t>
+      </w:r>
+    </w:p>
+    <w:p>
+      <w:pPr>
+        <w:pStyle w:val="ListParagraph"/>
+        <w:numPr>
+          <w:ilvl w:val="3"/>
+          <w:numId w:val="18"/>
+        </w:numPr>
+        <w:spacing w:after="0" w:line="240" w:lineRule="auto"/>
+        <w:rPr>
+          <w:rFonts w:ascii="Verdana" w:hAnsi="Verdana" w:cs="Arial"/>
+          <w:sz w:val="20"/>
+          <w:szCs w:val="20"/>
+        </w:rPr>
+      </w:pPr>
+      <w:r>
+        <w:rPr>
+          <w:rFonts w:ascii="Verdana" w:hAnsi="Verdana" w:cs="Arial"/>
+          <w:sz w:val="20"/>
+          <w:szCs w:val="20"/>
+        </w:rPr>
+        <w:t>Code Editing &amp; Refactoring: Provides intelligent code completion (IntelliSense), syntax highlighting, and robust refactoring capabilities to improve code readability and maintainability.</w:t>
+      </w:r>
+    </w:p>
+    <w:p>
+      <w:pPr>
+        <w:pStyle w:val="ListParagraph"/>
+        <w:numPr>
+          <w:ilvl w:val="3"/>
+          <w:numId w:val="18"/>
+        </w:numPr>
+        <w:spacing w:after="0" w:line="240" w:lineRule="auto"/>
+        <w:rPr>
+          <w:rFonts w:ascii="Verdana" w:hAnsi="Verdana" w:cs="Arial"/>
+          <w:sz w:val="20"/>
+          <w:szCs w:val="20"/>
+        </w:rPr>
+      </w:pPr>
+      <w:r>
+        <w:rPr>
+          <w:rFonts w:ascii="Verdana" w:hAnsi="Verdana" w:cs="Arial"/>
+          <w:sz w:val="20"/>
+          <w:szCs w:val="20"/>
+        </w:rPr>
+        <w:t>Integrated Testing Tools: Supports unit testing frameworks, allowing developers to write and execute tests directly within the IDE, ensuring code quality and bug prevention.</w:t>
+      </w:r>
+    </w:p>
+    <w:p>
+      <w:pPr>
+        <w:pStyle w:val="ListParagraph"/>
+        <w:numPr>
+          <w:ilvl w:val="3"/>
+          <w:numId w:val="18"/>
+        </w:numPr>
+        <w:spacing w:after="0" w:line="240" w:lineRule="auto"/>
+        <w:rPr>
+          <w:rFonts w:ascii="Verdana" w:hAnsi="Verdana" w:cs="Arial"/>
+          <w:sz w:val="20"/>
+          <w:szCs w:val="20"/>
+        </w:rPr>
+      </w:pPr>
+      <w:r>
+        <w:rPr>
+          <w:rFonts w:ascii="Verdana" w:hAnsi="Verdana" w:cs="Arial"/>
+          <w:sz w:val="20"/>
+          <w:szCs w:val="20"/>
+        </w:rPr>
+        <w:lastRenderedPageBreak/>
+        <w:t>Version Control Integration: Seamlessly integrates with Git (or other version control systems) for efficient code management and collaboration.</w:t>
+      </w:r>
+    </w:p>
+    <w:p>
+      <w:pPr>
+        <w:pStyle w:val="ListParagraph"/>
+        <w:numPr>
+          <w:ilvl w:val="1"/>
+          <w:numId w:val="18"/>
+        </w:numPr>
+        <w:spacing w:after="0" w:line="240" w:lineRule="auto"/>
+        <w:rPr>
+          <w:rFonts w:ascii="Verdana" w:hAnsi="Verdana" w:cs="Arial"/>
+          <w:sz w:val="20"/>
+          <w:szCs w:val="20"/>
+        </w:rPr>
+      </w:pPr>
+      <w:r>
+        <w:rPr>
+          <w:rFonts w:ascii="Verdana" w:hAnsi="Verdana" w:cs="Arial"/>
+          <w:sz w:val="20"/>
+          <w:szCs w:val="20"/>
+        </w:rPr>
+        <w:t>IntelliJ IDEA Ultimate (For Java based development)</w:t>
+      </w:r>
+    </w:p>
+    <w:p>
+      <w:pPr>
+        <w:pStyle w:val="ListParagraph"/>
+        <w:numPr>
+          <w:ilvl w:val="2"/>
+          <w:numId w:val="18"/>
+        </w:numPr>
+        <w:spacing w:after="0" w:line="240" w:lineRule="auto"/>
+        <w:rPr>
+          <w:rFonts w:ascii="Verdana" w:hAnsi="Verdana" w:cs="Arial"/>
+          <w:sz w:val="20"/>
+          <w:szCs w:val="20"/>
+        </w:rPr>
+      </w:pPr>
+      <w:r>
+        <w:rPr>
+          <w:rFonts w:ascii="Verdana" w:hAnsi="Verdana" w:cs="Arial"/>
+          <w:sz w:val="20"/>
+          <w:szCs w:val="20"/>
+        </w:rPr>
+        <w:t>Description: This IDE is a preferred choice for projects involving Java</w:t>
+      </w:r>
+      <w:r>
+        <w:rPr>
+          <w:rFonts w:ascii="Verdana" w:hAnsi="Verdana" w:cs="Arial"/>
+          <w:sz w:val="20"/>
+          <w:szCs w:val="20"/>
+        </w:rPr>
+        <w:t>.</w:t>
+      </w:r>
+      <w:r>
+        <w:rPr>
+          <w:rFonts w:ascii="Verdana" w:hAnsi="Verdana" w:cs="Arial"/>
+          <w:sz w:val="20"/>
+          <w:szCs w:val="20"/>
+        </w:rPr>
+        <w:t xml:space="preserve"> known for its strong focus on developer productivity.</w:t>
+      </w:r>
+    </w:p>
+    <w:p>
+      <w:pPr>
+        <w:pStyle w:val="ListParagraph"/>
+        <w:numPr>
+          <w:ilvl w:val="2"/>
+          <w:numId w:val="18"/>
+        </w:numPr>
+        <w:spacing w:after="0" w:line="240" w:lineRule="auto"/>
+        <w:rPr>
+          <w:rFonts w:ascii="Verdana" w:hAnsi="Verdana" w:cs="Arial"/>
+          <w:sz w:val="20"/>
+          <w:szCs w:val="20"/>
+        </w:rPr>
+      </w:pPr>
+      <w:r>
+        <w:rPr>
+          <w:rFonts w:ascii="Verdana" w:hAnsi="Verdana" w:cs="Arial"/>
+          <w:sz w:val="20"/>
+          <w:szCs w:val="20"/>
+        </w:rPr>
+        <w:t>Key Capabilities:</w:t>
+      </w:r>
+    </w:p>
+    <w:p>
+      <w:pPr>
+        <w:pStyle w:val="ListParagraph"/>
+        <w:numPr>
+          <w:ilvl w:val="3"/>
+          <w:numId w:val="18"/>
+        </w:numPr>
+        <w:spacing w:after="0" w:line="240" w:lineRule="auto"/>
+        <w:rPr>
+          <w:rFonts w:ascii="Verdana" w:hAnsi="Verdana" w:cs="Arial"/>
+          <w:sz w:val="20"/>
+          <w:szCs w:val="20"/>
+        </w:rPr>
+      </w:pPr>
+      <w:r>
+        <w:rPr>
+          <w:rFonts w:ascii="Verdana" w:hAnsi="Verdana" w:cs="Arial"/>
+          <w:sz w:val="20"/>
+          <w:szCs w:val="20"/>
+        </w:rPr>
+        <w:t>Smart Code Assistance: Provides highly intelligent code completion, static code analysis, and advanced refactoring tools that significantly speed up development and reduce errors.</w:t>
+      </w:r>
+    </w:p>
+    <w:p>
+      <w:pPr>
+        <w:pStyle w:val="ListParagraph"/>
+        <w:numPr>
+          <w:ilvl w:val="3"/>
+          <w:numId w:val="18"/>
+        </w:numPr>
+        <w:spacing w:after="0" w:line="240" w:lineRule="auto"/>
+        <w:rPr>
+          <w:rFonts w:ascii="Verdana" w:hAnsi="Verdana" w:cs="Arial"/>
+          <w:sz w:val="20"/>
+          <w:szCs w:val="20"/>
+        </w:rPr>
+      </w:pPr>
+      <w:r>
+        <w:rPr>
+          <w:rFonts w:ascii="Verdana" w:hAnsi="Verdana" w:cs="Arial"/>
+          <w:sz w:val="20"/>
+          <w:szCs w:val="20"/>
+        </w:rPr>
+        <w:t>Integrated Build Tools: Supports popular build automation tools like Maven and Gradle, streamlining the build process.</w:t>
+      </w:r>
+    </w:p>
+    <w:p>
+      <w:pPr>
+        <w:pStyle w:val="ListParagraph"/>
+        <w:numPr>
+          <w:ilvl w:val="3"/>
+          <w:numId w:val="18"/>
+        </w:numPr>
+        <w:spacing w:after="0" w:line="240" w:lineRule="auto"/>
+        <w:rPr>
+          <w:rFonts w:ascii="Verdana" w:hAnsi="Verdana" w:cs="Arial"/>
+          <w:sz w:val="20"/>
+          <w:szCs w:val="20"/>
+        </w:rPr>
+      </w:pPr>
+      <w:r>
+        <w:rPr>
+          <w:rFonts w:ascii="Verdana" w:hAnsi="Verdana" w:cs="Arial"/>
+          <w:sz w:val="20"/>
+          <w:szCs w:val="20"/>
+        </w:rPr>
+        <w:t>Database Tools: Includes built-in tools for database access and management, allowing developers to interact with local or remote databases directly.</w:t>
+      </w:r>
+    </w:p>
+    <w:p>
+      <w:pPr>
+        <w:pStyle w:val="ListParagraph"/>
+        <w:numPr>
+          <w:ilvl w:val="3"/>
+          <w:numId w:val="18"/>
+        </w:numPr>
+        <w:spacing w:after="0" w:line="240" w:lineRule="auto"/>
+        <w:rPr>
+          <w:rFonts w:ascii="Verdana" w:hAnsi="Verdana" w:cs="Arial"/>
+          <w:sz w:val="20"/>
+          <w:szCs w:val="20"/>
+        </w:rPr>
+      </w:pPr>
+      <w:r>
+        <w:rPr>
+          <w:rFonts w:ascii="Verdana" w:hAnsi="Verdana" w:cs="Arial"/>
+          <w:sz w:val="20"/>
+          <w:szCs w:val="20"/>
+        </w:rPr>
+        <w:t>Web &amp; Enterprise Development: Offers extensive support for various web frameworks and enterprise technologies, making it versatile for full-stack development.</w:t>
+      </w:r>
     </w:p>
     <w:p>
       <w:pPr>
@@ -4286,6 +6013,92 @@
     </w:lvl>
   </w:abstractNum>
   <w:abstractNum w:abstractNumId="8" w15:restartNumberingAfterBreak="0">
+    <w:nsid w:val="375D25B1"/>
+    <w:multiLevelType w:val="hybridMultilevel"/>
+    <w:tmpl w:val="B584330C"/>
+    <w:lvl w:ilvl="0" w:tplc="FFFFFFFF">
+      <w:start w:val="1"/>
+      <w:numFmt w:val="decimal"/>
+      <w:lvlText w:val="%1."/>
+      <w:lvlJc w:val="left"/>
+      <w:pPr>
+        <w:ind w:left="720" w:hanging="360"/>
+      </w:pPr>
+    </w:lvl>
+    <w:lvl w:ilvl="1" w:tplc="FFFFFFFF">
+      <w:start w:val="1"/>
+      <w:numFmt w:val="lowerLetter"/>
+      <w:lvlText w:val="%2."/>
+      <w:lvlJc w:val="left"/>
+      <w:pPr>
+        <w:ind w:left="1440" w:hanging="360"/>
+      </w:pPr>
+    </w:lvl>
+    <w:lvl w:ilvl="2" w:tplc="FFFFFFFF">
+      <w:start w:val="1"/>
+      <w:numFmt w:val="lowerRoman"/>
+      <w:lvlText w:val="%3."/>
+      <w:lvlJc w:val="right"/>
+      <w:pPr>
+        <w:ind w:left="2160" w:hanging="180"/>
+      </w:pPr>
+    </w:lvl>
+    <w:lvl w:ilvl="3" w:tplc="FFFFFFFF">
+      <w:start w:val="1"/>
+      <w:numFmt w:val="decimal"/>
+      <w:lvlText w:val="%4."/>
+      <w:lvlJc w:val="left"/>
+      <w:pPr>
+        <w:ind w:left="2880" w:hanging="360"/>
+      </w:pPr>
+    </w:lvl>
+    <w:lvl w:ilvl="4" w:tplc="FFFFFFFF" w:tentative="1">
+      <w:start w:val="1"/>
+      <w:numFmt w:val="lowerLetter"/>
+      <w:lvlText w:val="%5."/>
+      <w:lvlJc w:val="left"/>
+      <w:pPr>
+        <w:ind w:left="3600" w:hanging="360"/>
+      </w:pPr>
+    </w:lvl>
+    <w:lvl w:ilvl="5" w:tplc="FFFFFFFF" w:tentative="1">
+      <w:start w:val="1"/>
+      <w:numFmt w:val="lowerRoman"/>
+      <w:lvlText w:val="%6."/>
+      <w:lvlJc w:val="right"/>
+      <w:pPr>
+        <w:ind w:left="4320" w:hanging="180"/>
+      </w:pPr>
+    </w:lvl>
+    <w:lvl w:ilvl="6" w:tplc="FFFFFFFF" w:tentative="1">
+      <w:start w:val="1"/>
+      <w:numFmt w:val="decimal"/>
+      <w:lvlText w:val="%7."/>
+      <w:lvlJc w:val="left"/>
+      <w:pPr>
+        <w:ind w:left="5040" w:hanging="360"/>
+      </w:pPr>
+    </w:lvl>
+    <w:lvl w:ilvl="7" w:tplc="FFFFFFFF" w:tentative="1">
+      <w:start w:val="1"/>
+      <w:numFmt w:val="lowerLetter"/>
+      <w:lvlText w:val="%8."/>
+      <w:lvlJc w:val="left"/>
+      <w:pPr>
+        <w:ind w:left="5760" w:hanging="360"/>
+      </w:pPr>
+    </w:lvl>
+    <w:lvl w:ilvl="8" w:tplc="FFFFFFFF" w:tentative="1">
+      <w:start w:val="1"/>
+      <w:numFmt w:val="lowerRoman"/>
+      <w:lvlText w:val="%9."/>
+      <w:lvlJc w:val="right"/>
+      <w:pPr>
+        <w:ind w:left="6480" w:hanging="180"/>
+      </w:pPr>
+    </w:lvl>
+  </w:abstractNum>
+  <w:abstractNum w:abstractNumId="9" w15:restartNumberingAfterBreak="0">
     <w:nsid w:val="4B7D3F85"/>
     <w:multiLevelType w:val="hybridMultilevel"/>
     <w:tmpl w:val="342ABCC6"/>
@@ -4371,7 +6184,7 @@
       </w:pPr>
     </w:lvl>
   </w:abstractNum>
-  <w:abstractNum w:abstractNumId="9" w15:restartNumberingAfterBreak="0">
+  <w:abstractNum w:abstractNumId="10" w15:restartNumberingAfterBreak="0">
     <w:nsid w:val="50435E5C"/>
     <w:multiLevelType w:val="hybridMultilevel"/>
     <w:tmpl w:val="92F2F086"/>
@@ -4484,7 +6297,7 @@
       </w:rPr>
     </w:lvl>
   </w:abstractNum>
-  <w:abstractNum w:abstractNumId="10" w15:restartNumberingAfterBreak="0">
+  <w:abstractNum w:abstractNumId="11" w15:restartNumberingAfterBreak="0">
     <w:nsid w:val="573C681C"/>
     <w:multiLevelType w:val="hybridMultilevel"/>
     <w:tmpl w:val="9C1A4180"/>
@@ -4597,7 +6410,7 @@
       </w:pPr>
     </w:lvl>
   </w:abstractNum>
-  <w:abstractNum w:abstractNumId="11" w15:restartNumberingAfterBreak="0">
+  <w:abstractNum w:abstractNumId="12" w15:restartNumberingAfterBreak="0">
     <w:nsid w:val="60671FF2"/>
     <w:multiLevelType w:val="hybridMultilevel"/>
     <w:tmpl w:val="6A56F530"/>
@@ -4686,7 +6499,93 @@
       </w:pPr>
     </w:lvl>
   </w:abstractNum>
-  <w:abstractNum w:abstractNumId="12" w15:restartNumberingAfterBreak="0">
+  <w:abstractNum w:abstractNumId="13" w15:restartNumberingAfterBreak="0">
+    <w:nsid w:val="617C2A44"/>
+    <w:multiLevelType w:val="hybridMultilevel"/>
+    <w:tmpl w:val="B584330C"/>
+    <w:lvl w:ilvl="0" w:tplc="FFFFFFFF">
+      <w:start w:val="1"/>
+      <w:numFmt w:val="decimal"/>
+      <w:lvlText w:val="%1."/>
+      <w:lvlJc w:val="left"/>
+      <w:pPr>
+        <w:ind w:left="720" w:hanging="360"/>
+      </w:pPr>
+    </w:lvl>
+    <w:lvl w:ilvl="1" w:tplc="FFFFFFFF">
+      <w:start w:val="1"/>
+      <w:numFmt w:val="lowerLetter"/>
+      <w:lvlText w:val="%2."/>
+      <w:lvlJc w:val="left"/>
+      <w:pPr>
+        <w:ind w:left="1440" w:hanging="360"/>
+      </w:pPr>
+    </w:lvl>
+    <w:lvl w:ilvl="2" w:tplc="FFFFFFFF">
+      <w:start w:val="1"/>
+      <w:numFmt w:val="lowerRoman"/>
+      <w:lvlText w:val="%3."/>
+      <w:lvlJc w:val="right"/>
+      <w:pPr>
+        <w:ind w:left="2160" w:hanging="180"/>
+      </w:pPr>
+    </w:lvl>
+    <w:lvl w:ilvl="3" w:tplc="FFFFFFFF">
+      <w:start w:val="1"/>
+      <w:numFmt w:val="decimal"/>
+      <w:lvlText w:val="%4."/>
+      <w:lvlJc w:val="left"/>
+      <w:pPr>
+        <w:ind w:left="2880" w:hanging="360"/>
+      </w:pPr>
+    </w:lvl>
+    <w:lvl w:ilvl="4" w:tplc="FFFFFFFF" w:tentative="1">
+      <w:start w:val="1"/>
+      <w:numFmt w:val="lowerLetter"/>
+      <w:lvlText w:val="%5."/>
+      <w:lvlJc w:val="left"/>
+      <w:pPr>
+        <w:ind w:left="3600" w:hanging="360"/>
+      </w:pPr>
+    </w:lvl>
+    <w:lvl w:ilvl="5" w:tplc="FFFFFFFF" w:tentative="1">
+      <w:start w:val="1"/>
+      <w:numFmt w:val="lowerRoman"/>
+      <w:lvlText w:val="%6."/>
+      <w:lvlJc w:val="right"/>
+      <w:pPr>
+        <w:ind w:left="4320" w:hanging="180"/>
+      </w:pPr>
+    </w:lvl>
+    <w:lvl w:ilvl="6" w:tplc="FFFFFFFF" w:tentative="1">
+      <w:start w:val="1"/>
+      <w:numFmt w:val="decimal"/>
+      <w:lvlText w:val="%7."/>
+      <w:lvlJc w:val="left"/>
+      <w:pPr>
+        <w:ind w:left="5040" w:hanging="360"/>
+      </w:pPr>
+    </w:lvl>
+    <w:lvl w:ilvl="7" w:tplc="FFFFFFFF" w:tentative="1">
+      <w:start w:val="1"/>
+      <w:numFmt w:val="lowerLetter"/>
+      <w:lvlText w:val="%8."/>
+      <w:lvlJc w:val="left"/>
+      <w:pPr>
+        <w:ind w:left="5760" w:hanging="360"/>
+      </w:pPr>
+    </w:lvl>
+    <w:lvl w:ilvl="8" w:tplc="FFFFFFFF" w:tentative="1">
+      <w:start w:val="1"/>
+      <w:numFmt w:val="lowerRoman"/>
+      <w:lvlText w:val="%9."/>
+      <w:lvlJc w:val="right"/>
+      <w:pPr>
+        <w:ind w:left="6480" w:hanging="180"/>
+      </w:pPr>
+    </w:lvl>
+  </w:abstractNum>
+  <w:abstractNum w:abstractNumId="14" w15:restartNumberingAfterBreak="0">
     <w:nsid w:val="63EA4D81"/>
     <w:multiLevelType w:val="hybridMultilevel"/>
     <w:tmpl w:val="4CF6E376"/>
@@ -4714,7 +6613,7 @@
         <w:rFonts w:ascii="Courier New" w:hAnsi="Courier New" w:cs="Courier New" w:hint="default"/>
       </w:rPr>
     </w:lvl>
-    <w:lvl w:ilvl="2" w:tplc="04090005" w:tentative="1">
+    <w:lvl w:ilvl="2" w:tplc="04090005">
       <w:start w:val="1"/>
       <w:numFmt w:val="bullet"/>
       <w:lvlText w:val=""/>
@@ -4799,7 +6698,7 @@
       </w:rPr>
     </w:lvl>
   </w:abstractNum>
-  <w:abstractNum w:abstractNumId="13" w15:restartNumberingAfterBreak="0">
+  <w:abstractNum w:abstractNumId="15" w15:restartNumberingAfterBreak="0">
     <w:nsid w:val="66157158"/>
     <w:multiLevelType w:val="hybridMultilevel"/>
     <w:tmpl w:val="B584330C"/>
@@ -4885,7 +6784,93 @@
       </w:pPr>
     </w:lvl>
   </w:abstractNum>
-  <w:abstractNum w:abstractNumId="14" w15:restartNumberingAfterBreak="0">
+  <w:abstractNum w:abstractNumId="16" w15:restartNumberingAfterBreak="0">
+    <w:nsid w:val="74B932CD"/>
+    <w:multiLevelType w:val="hybridMultilevel"/>
+    <w:tmpl w:val="2D94D86C"/>
+    <w:lvl w:ilvl="0" w:tplc="0409000F">
+      <w:start w:val="1"/>
+      <w:numFmt w:val="decimal"/>
+      <w:lvlText w:val="%1."/>
+      <w:lvlJc w:val="left"/>
+      <w:pPr>
+        <w:ind w:left="360" w:hanging="360"/>
+      </w:pPr>
+    </w:lvl>
+    <w:lvl w:ilvl="1" w:tplc="04090019">
+      <w:start w:val="1"/>
+      <w:numFmt w:val="lowerLetter"/>
+      <w:lvlText w:val="%2."/>
+      <w:lvlJc w:val="left"/>
+      <w:pPr>
+        <w:ind w:left="1080" w:hanging="360"/>
+      </w:pPr>
+    </w:lvl>
+    <w:lvl w:ilvl="2" w:tplc="0409001B">
+      <w:start w:val="1"/>
+      <w:numFmt w:val="lowerRoman"/>
+      <w:lvlText w:val="%3."/>
+      <w:lvlJc w:val="right"/>
+      <w:pPr>
+        <w:ind w:left="1800" w:hanging="180"/>
+      </w:pPr>
+    </w:lvl>
+    <w:lvl w:ilvl="3" w:tplc="0409000F">
+      <w:start w:val="1"/>
+      <w:numFmt w:val="decimal"/>
+      <w:lvlText w:val="%4."/>
+      <w:lvlJc w:val="left"/>
+      <w:pPr>
+        <w:ind w:left="2520" w:hanging="360"/>
+      </w:pPr>
+    </w:lvl>
+    <w:lvl w:ilvl="4" w:tplc="04090019" w:tentative="1">
+      <w:start w:val="1"/>
+      <w:numFmt w:val="lowerLetter"/>
+      <w:lvlText w:val="%5."/>
+      <w:lvlJc w:val="left"/>
+      <w:pPr>
+        <w:ind w:left="3240" w:hanging="360"/>
+      </w:pPr>
+    </w:lvl>
+    <w:lvl w:ilvl="5" w:tplc="0409001B" w:tentative="1">
+      <w:start w:val="1"/>
+      <w:numFmt w:val="lowerRoman"/>
+      <w:lvlText w:val="%6."/>
+      <w:lvlJc w:val="right"/>
+      <w:pPr>
+        <w:ind w:left="3960" w:hanging="180"/>
+      </w:pPr>
+    </w:lvl>
+    <w:lvl w:ilvl="6" w:tplc="0409000F" w:tentative="1">
+      <w:start w:val="1"/>
+      <w:numFmt w:val="decimal"/>
+      <w:lvlText w:val="%7."/>
+      <w:lvlJc w:val="left"/>
+      <w:pPr>
+        <w:ind w:left="4680" w:hanging="360"/>
+      </w:pPr>
+    </w:lvl>
+    <w:lvl w:ilvl="7" w:tplc="04090019" w:tentative="1">
+      <w:start w:val="1"/>
+      <w:numFmt w:val="lowerLetter"/>
+      <w:lvlText w:val="%8."/>
+      <w:lvlJc w:val="left"/>
+      <w:pPr>
+        <w:ind w:left="5400" w:hanging="360"/>
+      </w:pPr>
+    </w:lvl>
+    <w:lvl w:ilvl="8" w:tplc="0409001B" w:tentative="1">
+      <w:start w:val="1"/>
+      <w:numFmt w:val="lowerRoman"/>
+      <w:lvlText w:val="%9."/>
+      <w:lvlJc w:val="right"/>
+      <w:pPr>
+        <w:ind w:left="6120" w:hanging="180"/>
+      </w:pPr>
+    </w:lvl>
+  </w:abstractNum>
+  <w:abstractNum w:abstractNumId="17" w15:restartNumberingAfterBreak="0">
     <w:nsid w:val="778B6EEC"/>
     <w:multiLevelType w:val="hybridMultilevel"/>
     <w:tmpl w:val="2494AD16"/>
@@ -5002,19 +6987,19 @@
     <w:abstractNumId w:val="1"/>
   </w:num>
   <w:num w:numId="2" w16cid:durableId="1788430539">
-    <w:abstractNumId w:val="10"/>
+    <w:abstractNumId w:val="11"/>
   </w:num>
   <w:num w:numId="3" w16cid:durableId="88083760">
-    <w:abstractNumId w:val="11"/>
+    <w:abstractNumId w:val="12"/>
   </w:num>
   <w:num w:numId="4" w16cid:durableId="302465446">
-    <w:abstractNumId w:val="8"/>
+    <w:abstractNumId w:val="9"/>
   </w:num>
   <w:num w:numId="5" w16cid:durableId="1502886874">
     <w:abstractNumId w:val="7"/>
   </w:num>
   <w:num w:numId="6" w16cid:durableId="900288135">
-    <w:abstractNumId w:val="12"/>
+    <w:abstractNumId w:val="14"/>
   </w:num>
   <w:num w:numId="7" w16cid:durableId="649290782">
     <w:abstractNumId w:val="6"/>
@@ -5029,19 +7014,28 @@
     <w:abstractNumId w:val="5"/>
   </w:num>
   <w:num w:numId="11" w16cid:durableId="251474012">
-    <w:abstractNumId w:val="14"/>
+    <w:abstractNumId w:val="17"/>
   </w:num>
   <w:num w:numId="12" w16cid:durableId="1775131934">
     <w:abstractNumId w:val="2"/>
   </w:num>
   <w:num w:numId="13" w16cid:durableId="271978231">
-    <w:abstractNumId w:val="9"/>
+    <w:abstractNumId w:val="10"/>
   </w:num>
   <w:num w:numId="14" w16cid:durableId="151530716">
-    <w:abstractNumId w:val="13"/>
+    <w:abstractNumId w:val="15"/>
   </w:num>
   <w:num w:numId="15" w16cid:durableId="1286235883">
     <w:abstractNumId w:val="0"/>
+  </w:num>
+  <w:num w:numId="16" w16cid:durableId="546452709">
+    <w:abstractNumId w:val="16"/>
+  </w:num>
+  <w:num w:numId="17" w16cid:durableId="532688891">
+    <w:abstractNumId w:val="13"/>
+  </w:num>
+  <w:num w:numId="18" w16cid:durableId="744844425">
+    <w:abstractNumId w:val="8"/>
   </w:num>
 </w:numbering>
 </file>
@@ -5492,7 +7486,6 @@
   <w:style w:type="character" w:default="1" w:styleId="DefaultParagraphFont">
     <w:name w:val="Default Paragraph Font"/>
     <w:uiPriority w:val="1"/>
-    <w:semiHidden/>
     <w:unhideWhenUsed/>
   </w:style>
   <w:style w:type="table" w:default="1" w:styleId="TableNormal">
@@ -5965,48 +7958,6 @@
 </file>
 
 <file path=customXml/item3.xml><?xml version="1.0" encoding="utf-8"?>
-<p:properties xmlns:p="http://schemas.microsoft.com/office/2006/metadata/properties" xmlns:xsi="http://www.w3.org/2001/XMLSchema-instance" xmlns:pc="http://schemas.microsoft.com/office/infopath/2007/PartnerControls">
-  <documentManagement>
-    <Vendor xmlns="0feec74c-ecc7-44c3-9c64-3623cf89ed41">N/A</Vendor>
-    <_ip_UnifiedCompliancePolicyUIAction xmlns="http://schemas.microsoft.com/sharepoint/v3" xsi:nil="true"/>
-    <Launch_x0020_Date xmlns="0feec74c-ecc7-44c3-9c64-3623cf89ed41" xsi:nil="true"/>
-    <Discipline xmlns="0feec74c-ecc7-44c3-9c64-3623cf89ed41" xsi:nil="true"/>
-    <Course_x0020_code xmlns="0feec74c-ecc7-44c3-9c64-3623cf89ed41" xsi:nil="true"/>
-    <Performance_x0020_Steps_x0020_Completed xmlns="0feec74c-ecc7-44c3-9c64-3623cf89ed41">
-      <Value>N/A</Value>
-    </Performance_x0020_Steps_x0020_Completed>
-    <Course_x0020_short_x0020_name xmlns="0feec74c-ecc7-44c3-9c64-3623cf89ed41" xsi:nil="true"/>
-    <_ip_UnifiedCompliancePolicyProperties xmlns="http://schemas.microsoft.com/sharepoint/v3" xsi:nil="true"/>
-    <AssessmentCode xmlns="0feec74c-ecc7-44c3-9c64-3623cf89ed41" xsi:nil="true"/>
-    <Course_x0020_number xmlns="0feec74c-ecc7-44c3-9c64-3623cf89ed41" xsi:nil="true"/>
-    <Course_x0020_title xmlns="0feec74c-ecc7-44c3-9c64-3623cf89ed41" xsi:nil="true"/>
-    <d5fh xmlns="0feec74c-ecc7-44c3-9c64-3623cf89ed41" xsi:nil="true"/>
-    <Step_x0020_Completed xmlns="0feec74c-ecc7-44c3-9c64-3623cf89ed41">
-      <Value>N/A</Value>
-    </Step_x0020_Completed>
-    <Assessment_x0020_Type xmlns="0feec74c-ecc7-44c3-9c64-3623cf89ed41">
-      <Value>Objective</Value>
-    </Assessment_x0020_Type>
-    <Publication_x0020_Date xmlns="0feec74c-ecc7-44c3-9c64-3623cf89ed41" xsi:nil="true"/>
-    <SME xmlns="0feec74c-ecc7-44c3-9c64-3623cf89ed41" xsi:nil="true"/>
-    <Editor0 xmlns="0feec74c-ecc7-44c3-9c64-3623cf89ed41">
-      <UserInfo>
-        <DisplayName/>
-        <AccountId xsi:nil="true"/>
-        <AccountType/>
-      </UserInfo>
-    </Editor0>
-    <Doc_x0020_Type xmlns="0feec74c-ecc7-44c3-9c64-3623cf89ed41" xsi:nil="true"/>
-    <qrac xmlns="0feec74c-ecc7-44c3-9c64-3623cf89ed41" xsi:nil="true"/>
-    <lcf76f155ced4ddcb4097134ff3c332f xmlns="0feec74c-ecc7-44c3-9c64-3623cf89ed41">
-      <Terms xmlns="http://schemas.microsoft.com/office/infopath/2007/PartnerControls"/>
-    </lcf76f155ced4ddcb4097134ff3c332f>
-    <TaxCatchAll xmlns="1f707338-ea0f-4fe5-baee-59b996692b22" xsi:nil="true"/>
-  </documentManagement>
-</p:properties>
-</file>
-
-<file path=customXml/item4.xml><?xml version="1.0" encoding="utf-8"?>
 <ct:contentTypeSchema xmlns:ct="http://schemas.microsoft.com/office/2006/metadata/contentType" xmlns:ma="http://schemas.microsoft.com/office/2006/metadata/properties/metaAttributes" ct:_="" ma:_="" ma:contentTypeName="Document" ma:contentTypeID="0x010100C39F2A75005F2D43B30369DAED2CCB1C" ma:contentTypeVersion="45" ma:contentTypeDescription="Create a new document." ma:contentTypeScope="" ma:versionID="1b9fdb374581140854a9d0518901e886">
   <xsd:schema xmlns:xsd="http://www.w3.org/2001/XMLSchema" xmlns:xs="http://www.w3.org/2001/XMLSchema" xmlns:p="http://schemas.microsoft.com/office/2006/metadata/properties" xmlns:ns1="http://schemas.microsoft.com/sharepoint/v3" xmlns:ns2="0feec74c-ecc7-44c3-9c64-3623cf89ed41" xmlns:ns3="1f707338-ea0f-4fe5-baee-59b996692b22" targetNamespace="http://schemas.microsoft.com/office/2006/metadata/properties" ma:root="true" ma:fieldsID="d4e90b57406cfd253bd268c9429fcd51" ns1:_="" ns2:_="" ns3:_="">
     <xsd:import namespace="http://schemas.microsoft.com/sharepoint/v3"/>
@@ -6478,6 +8429,48 @@
 </ct:contentTypeSchema>
 </file>
 
+<file path=customXml/item4.xml><?xml version="1.0" encoding="utf-8"?>
+<p:properties xmlns:p="http://schemas.microsoft.com/office/2006/metadata/properties" xmlns:xsi="http://www.w3.org/2001/XMLSchema-instance" xmlns:pc="http://schemas.microsoft.com/office/infopath/2007/PartnerControls">
+  <documentManagement>
+    <Vendor xmlns="0feec74c-ecc7-44c3-9c64-3623cf89ed41">N/A</Vendor>
+    <_ip_UnifiedCompliancePolicyUIAction xmlns="http://schemas.microsoft.com/sharepoint/v3" xsi:nil="true"/>
+    <Launch_x0020_Date xmlns="0feec74c-ecc7-44c3-9c64-3623cf89ed41" xsi:nil="true"/>
+    <Discipline xmlns="0feec74c-ecc7-44c3-9c64-3623cf89ed41" xsi:nil="true"/>
+    <Course_x0020_code xmlns="0feec74c-ecc7-44c3-9c64-3623cf89ed41" xsi:nil="true"/>
+    <Performance_x0020_Steps_x0020_Completed xmlns="0feec74c-ecc7-44c3-9c64-3623cf89ed41">
+      <Value>N/A</Value>
+    </Performance_x0020_Steps_x0020_Completed>
+    <Course_x0020_short_x0020_name xmlns="0feec74c-ecc7-44c3-9c64-3623cf89ed41" xsi:nil="true"/>
+    <_ip_UnifiedCompliancePolicyProperties xmlns="http://schemas.microsoft.com/sharepoint/v3" xsi:nil="true"/>
+    <AssessmentCode xmlns="0feec74c-ecc7-44c3-9c64-3623cf89ed41" xsi:nil="true"/>
+    <Course_x0020_number xmlns="0feec74c-ecc7-44c3-9c64-3623cf89ed41" xsi:nil="true"/>
+    <Course_x0020_title xmlns="0feec74c-ecc7-44c3-9c64-3623cf89ed41" xsi:nil="true"/>
+    <d5fh xmlns="0feec74c-ecc7-44c3-9c64-3623cf89ed41" xsi:nil="true"/>
+    <Step_x0020_Completed xmlns="0feec74c-ecc7-44c3-9c64-3623cf89ed41">
+      <Value>N/A</Value>
+    </Step_x0020_Completed>
+    <Assessment_x0020_Type xmlns="0feec74c-ecc7-44c3-9c64-3623cf89ed41">
+      <Value>Objective</Value>
+    </Assessment_x0020_Type>
+    <Publication_x0020_Date xmlns="0feec74c-ecc7-44c3-9c64-3623cf89ed41" xsi:nil="true"/>
+    <SME xmlns="0feec74c-ecc7-44c3-9c64-3623cf89ed41" xsi:nil="true"/>
+    <Editor0 xmlns="0feec74c-ecc7-44c3-9c64-3623cf89ed41">
+      <UserInfo>
+        <DisplayName/>
+        <AccountId xsi:nil="true"/>
+        <AccountType/>
+      </UserInfo>
+    </Editor0>
+    <Doc_x0020_Type xmlns="0feec74c-ecc7-44c3-9c64-3623cf89ed41" xsi:nil="true"/>
+    <qrac xmlns="0feec74c-ecc7-44c3-9c64-3623cf89ed41" xsi:nil="true"/>
+    <lcf76f155ced4ddcb4097134ff3c332f xmlns="0feec74c-ecc7-44c3-9c64-3623cf89ed41">
+      <Terms xmlns="http://schemas.microsoft.com/office/infopath/2007/PartnerControls"/>
+    </lcf76f155ced4ddcb4097134ff3c332f>
+    <TaxCatchAll xmlns="1f707338-ea0f-4fe5-baee-59b996692b22" xsi:nil="true"/>
+  </documentManagement>
+</p:properties>
+</file>
+
 <file path=customXml/itemProps1.xml><?xml version="1.0" encoding="utf-8"?>
 <ds:datastoreItem xmlns:ds="http://schemas.openxmlformats.org/officeDocument/2006/customXml" ds:itemID="{55AF091B-3C7A-41E3-B477-F2FDAA23CFDA}">
   <ds:schemaRefs>
@@ -6495,18 +8488,6 @@
 </file>
 
 <file path=customXml/itemProps3.xml><?xml version="1.0" encoding="utf-8"?>
-<ds:datastoreItem xmlns:ds="http://schemas.openxmlformats.org/officeDocument/2006/customXml" ds:itemID="{E23E4120-D6A2-4237-8072-707FB1C50E55}">
-  <ds:schemaRefs>
-    <ds:schemaRef ds:uri="http://schemas.microsoft.com/office/2006/metadata/properties"/>
-    <ds:schemaRef ds:uri="http://schemas.microsoft.com/office/infopath/2007/PartnerControls"/>
-    <ds:schemaRef ds:uri="0feec74c-ecc7-44c3-9c64-3623cf89ed41"/>
-    <ds:schemaRef ds:uri="http://schemas.microsoft.com/sharepoint/v3"/>
-    <ds:schemaRef ds:uri="1f707338-ea0f-4fe5-baee-59b996692b22"/>
-  </ds:schemaRefs>
-</ds:datastoreItem>
-</file>
-
-<file path=customXml/itemProps4.xml><?xml version="1.0" encoding="utf-8"?>
 <ds:datastoreItem xmlns:ds="http://schemas.openxmlformats.org/officeDocument/2006/customXml" ds:itemID="{A5D04F1A-573F-4449-9B26-6F35AD920F9A}">
   <ds:schemaRefs>
     <ds:schemaRef ds:uri="http://schemas.microsoft.com/office/2006/metadata/contentType"/>
@@ -6526,6 +8507,18 @@
 </ds:datastoreItem>
 </file>
 
+<file path=customXml/itemProps4.xml><?xml version="1.0" encoding="utf-8"?>
+<ds:datastoreItem xmlns:ds="http://schemas.openxmlformats.org/officeDocument/2006/customXml" ds:itemID="{E23E4120-D6A2-4237-8072-707FB1C50E55}">
+  <ds:schemaRefs>
+    <ds:schemaRef ds:uri="http://schemas.microsoft.com/office/2006/metadata/properties"/>
+    <ds:schemaRef ds:uri="http://schemas.microsoft.com/office/infopath/2007/PartnerControls"/>
+    <ds:schemaRef ds:uri="0feec74c-ecc7-44c3-9c64-3623cf89ed41"/>
+    <ds:schemaRef ds:uri="http://schemas.microsoft.com/sharepoint/v3"/>
+    <ds:schemaRef ds:uri="1f707338-ea0f-4fe5-baee-59b996692b22"/>
+  </ds:schemaRefs>
+</ds:datastoreItem>
+</file>
+
 <file path=docMetadata/LabelInfo.xml><?xml version="1.0" encoding="utf-8"?>
 <clbl:labelList xmlns:clbl="http://schemas.microsoft.com/office/2020/mipLabelMetadata">
   <clbl:label id="{9d258917-277f-42cd-a3cd-14c4e9ee58bc}" enabled="1" method="Standard" siteId="{38ae3bcd-9579-4fd4-adda-b42e1495d55a}" contentBits="0" removed="0"/>

</xml_diff>